<commit_message>
Aggiorna l'elenco delle funzionalità in Word
Aggiunge le 17 funzioni arrivate dopo il 25 ottobre (lingue, schermo al
tavolo, puntatore laser, connettori, token in incognito, quota, punti
ferita, condizioni, mappe UVTT, tetti, porte segrete, meteo, «Mostra ai
giocatori», note del GM…), corregge le righe superate e aggiorna
scorciatoie, limiti e data.

Co-Authored-By: Claude Opus 5.5 <noreply@anthropic.com>
</commit_message>
<xml_diff>
--- a/docs/Scryboard-Funzionalita.docx
+++ b/docs/Scryboard-Funzionalita.docx
@@ -45,7 +45,7 @@
           <w:color w:val="555560"/>
           <w:sz w:val="20"/>
         </w:rPr>
-        <w:t>Versione del documento: 25 ottobre 2026</w:t>
+        <w:t>Versione del documento: 27 ottobre 2026</w:t>
       </w:r>
     </w:p>
     <w:p>
@@ -238,7 +238,7 @@
           <w:i/>
           <w:color w:val="555560"/>
         </w:rPr>
-        <w:t>In totale: 12 aree e 71 funzionalità descritte.</w:t>
+        <w:t>In totale: 12 aree e 88 funzionalità descritte.</w:t>
       </w:r>
     </w:p>
     <w:p>
@@ -364,7 +364,7 @@
                 <w:i w:val="0"/>
                 <w:sz w:val="20"/>
               </w:rPr>
-              <w:t>Creazione della stanza</w:t>
+              <w:t xml:space="preserve">Creazione della stanza</w:t>
             </w:r>
           </w:p>
         </w:tc>
@@ -382,7 +382,7 @@
                 <w:i w:val="0"/>
                 <w:sz w:val="20"/>
               </w:rPr>
-              <w:t>Chi crea una stanza diventa GM e riceve due link: quello del GM, con un token segreto nel frammento dell'indirizzo (il browser non lo invia mai al server nelle richieste), e quello da dare ai giocatori.</w:t>
+              <w:t xml:space="preserve">Chi crea una stanza diventa GM e riceve due link: quello del GM, con un token segreto nel frammento dell'indirizzo (il browser non lo invia mai al server nelle richieste), e quello da dare ai giocatori.</w:t>
             </w:r>
           </w:p>
         </w:tc>
@@ -402,7 +402,7 @@
                 <w:color w:val="5B44B8"/>
                 <w:sz w:val="18"/>
               </w:rPr>
-              <w:t>Solo GM</w:t>
+              <w:t xml:space="preserve">Solo GM</w:t>
             </w:r>
           </w:p>
         </w:tc>
@@ -426,7 +426,7 @@
                 <w:i w:val="0"/>
                 <w:sz w:val="20"/>
               </w:rPr>
-              <w:t>Ingresso senza account</w:t>
+              <w:t xml:space="preserve">Ingresso senza account</w:t>
             </w:r>
           </w:p>
         </w:tc>
@@ -445,7 +445,7 @@
                 <w:i w:val="0"/>
                 <w:sz w:val="20"/>
               </w:rPr>
-              <w:t>Ogni partecipante sceglie un nome e un colore; il profilo resta salvato nel browser e alla volta successiva si entra direttamente.</w:t>
+              <w:t xml:space="preserve">Ogni partecipante sceglie un nome e un colore; il profilo resta salvato nel browser e alla volta successiva si entra direttamente.</w:t>
             </w:r>
           </w:p>
         </w:tc>
@@ -466,7 +466,7 @@
                 <w:color w:val="555560"/>
                 <w:sz w:val="18"/>
               </w:rPr>
-              <w:t>Tutti</w:t>
+              <w:t xml:space="preserve">Tutti</w:t>
             </w:r>
           </w:p>
         </w:tc>
@@ -489,7 +489,7 @@
                 <w:i w:val="0"/>
                 <w:sz w:val="20"/>
               </w:rPr>
-              <w:t>Elenco «Al tavolo»</w:t>
+              <w:t xml:space="preserve">Italiano e inglese</w:t>
             </w:r>
           </w:p>
         </w:tc>
@@ -507,7 +507,7 @@
                 <w:i w:val="0"/>
                 <w:sz w:val="20"/>
               </w:rPr>
-              <w:t>La barra laterale mostra chi è connesso, con il colore di ciascuno e il badge GM, in tempo reale e per tutta la stanza (anche tra scene diverse).</w:t>
+              <w:t xml:space="preserve">L'interfaccia è in italiano e in inglese: la lingua si sceglie in alto a destra e resta salvata nel browser. Sono tradotte anche le etichette dei cataloghi (biomi, timbri, condizioni…).</w:t>
             </w:r>
           </w:p>
         </w:tc>
@@ -527,7 +527,7 @@
                 <w:color w:val="555560"/>
                 <w:sz w:val="18"/>
               </w:rPr>
-              <w:t>Tutti</w:t>
+              <w:t xml:space="preserve">Tutti</w:t>
             </w:r>
           </w:p>
         </w:tc>
@@ -551,7 +551,7 @@
                 <w:i w:val="0"/>
                 <w:sz w:val="20"/>
               </w:rPr>
-              <w:t>Cursori e presenza</w:t>
+              <w:t xml:space="preserve">Elenco «Al tavolo»</w:t>
             </w:r>
           </w:p>
         </w:tc>
@@ -570,7 +570,7 @@
                 <w:i w:val="0"/>
                 <w:sz w:val="20"/>
               </w:rPr>
-              <w:t>Si vedono i puntatori degli altri con il loro nome e i tratti che stanno disegnando mentre li disegnano.</w:t>
+              <w:t xml:space="preserve">La barra laterale mostra chi è connesso, con il colore di ciascuno e il badge GM, in tempo reale e per tutta la stanza (anche tra scene diverse). Lo schermo al tavolo compare con il badge «Schermo».</w:t>
             </w:r>
           </w:p>
         </w:tc>
@@ -591,7 +591,7 @@
                 <w:color w:val="555560"/>
                 <w:sz w:val="18"/>
               </w:rPr>
-              <w:t>Tutti</w:t>
+              <w:t xml:space="preserve">Tutti</w:t>
             </w:r>
           </w:p>
         </w:tc>
@@ -614,7 +614,7 @@
                 <w:i w:val="0"/>
                 <w:sz w:val="20"/>
               </w:rPr>
-              <w:t>Salvataggio automatico</w:t>
+              <w:t xml:space="preserve">Barra laterale richiudibile</w:t>
             </w:r>
           </w:p>
         </w:tc>
@@ -632,7 +632,7 @@
                 <w:i w:val="0"/>
                 <w:sz w:val="20"/>
               </w:rPr>
-              <w:t>Ogni modifica viene salvata di continuo: riaprendo il link si ritrova la lavagna com'era.</w:t>
+              <w:t xml:space="preserve">Un pulsante nell'intestazione nasconde la barra laterale e lascia tutto lo spazio alla lavagna.</w:t>
             </w:r>
           </w:p>
         </w:tc>
@@ -652,7 +652,7 @@
                 <w:color w:val="555560"/>
                 <w:sz w:val="18"/>
               </w:rPr>
-              <w:t>Tutti</w:t>
+              <w:t xml:space="preserve">Tutti</w:t>
             </w:r>
           </w:p>
         </w:tc>
@@ -676,7 +676,7 @@
                 <w:i w:val="0"/>
                 <w:sz w:val="20"/>
               </w:rPr>
-              <w:t>Riconnessione e inattività</w:t>
+              <w:t xml:space="preserve">Cursori e presenza</w:t>
             </w:r>
           </w:p>
         </w:tc>
@@ -695,7 +695,7 @@
                 <w:i w:val="0"/>
                 <w:sz w:val="20"/>
               </w:rPr>
-              <w:t>Dopo 10 minuti senza attività i client si disconnettono (così il server può spegnersi) e riprendono da soli alla prima interazione.</w:t>
+              <w:t xml:space="preserve">Si vedono i puntatori degli altri con il loro nome e i tratti che stanno disegnando mentre li disegnano.</w:t>
             </w:r>
           </w:p>
         </w:tc>
@@ -716,7 +716,7 @@
                 <w:color w:val="555560"/>
                 <w:sz w:val="18"/>
               </w:rPr>
-              <w:t>Tutti</w:t>
+              <w:t xml:space="preserve">Tutti</w:t>
             </w:r>
           </w:p>
         </w:tc>
@@ -739,7 +739,7 @@
                 <w:i w:val="0"/>
                 <w:sz w:val="20"/>
               </w:rPr>
-              <w:t>Pulizia delle stanze</w:t>
+              <w:t xml:space="preserve">Schermo al tavolo</w:t>
             </w:r>
           </w:p>
         </w:tc>
@@ -757,13 +757,77 @@
                 <w:i w:val="0"/>
                 <w:sz w:val="20"/>
               </w:rPr>
-              <w:t>Le stanze inattive da 90 giorni vengono eliminate dal server, con documenti e immagini.</w:t>
+              <w:t xml:space="preserve">Un link apposito (pannello Condividi) apre la lavagna su una TV o un proiettore come la vedono i giocatori, senza comandi né cursori e con un'identità sua, anche se aperto nel browser del GM. Inquadra da solo i token del gruppo, segue «Porta qui i giocatori», mostra di chi è il turno e, con la visione dinamica, ciò che vede tutto il gruppo.</w:t>
             </w:r>
           </w:p>
         </w:tc>
         <w:tc>
           <w:tcPr>
             <w:tcW w:type="dxa" w:w="1020"/>
+          </w:tcPr>
+          <w:p>
+            <w:pPr>
+              <w:spacing w:after="0"/>
+              <w:jc w:val="center"/>
+            </w:pPr>
+            <w:r>
+              <w:rPr>
+                <w:b/>
+                <w:i w:val="0"/>
+                <w:color w:val="5B44B8"/>
+                <w:sz w:val="18"/>
+              </w:rPr>
+              <w:t xml:space="preserve">Solo GM</w:t>
+            </w:r>
+          </w:p>
+        </w:tc>
+      </w:tr>
+      <w:tr>
+        <w:trPr>
+          <w:cantSplit w:val="true"/>
+        </w:trPr>
+        <w:tc>
+          <w:tcPr>
+            <w:tcW w:type="dxa" w:w="2041"/>
+            <w:shd w:val="clear" w:color="auto" w:fill="F8F6FD"/>
+          </w:tcPr>
+          <w:p>
+            <w:pPr>
+              <w:spacing w:after="0"/>
+            </w:pPr>
+            <w:r>
+              <w:rPr>
+                <w:b/>
+                <w:i w:val="0"/>
+                <w:sz w:val="20"/>
+              </w:rPr>
+              <w:t xml:space="preserve">Salvataggio automatico</w:t>
+            </w:r>
+          </w:p>
+        </w:tc>
+        <w:tc>
+          <w:tcPr>
+            <w:tcW w:type="dxa" w:w="6576"/>
+            <w:shd w:val="clear" w:color="auto" w:fill="F8F6FD"/>
+          </w:tcPr>
+          <w:p>
+            <w:pPr>
+              <w:spacing w:after="0"/>
+            </w:pPr>
+            <w:r>
+              <w:rPr>
+                <w:b w:val="0"/>
+                <w:i w:val="0"/>
+                <w:sz w:val="20"/>
+              </w:rPr>
+              <w:t xml:space="preserve">Ogni modifica viene salvata di continuo: riaprendo il link si ritrova la lavagna com'era.</w:t>
+            </w:r>
+          </w:p>
+        </w:tc>
+        <w:tc>
+          <w:tcPr>
+            <w:tcW w:type="dxa" w:w="1020"/>
+            <w:shd w:val="clear" w:color="auto" w:fill="F8F6FD"/>
           </w:tcPr>
           <w:p>
             <w:pPr>
@@ -777,7 +841,132 @@
                 <w:color w:val="555560"/>
                 <w:sz w:val="18"/>
               </w:rPr>
-              <w:t>Server</w:t>
+              <w:t xml:space="preserve">Tutti</w:t>
+            </w:r>
+          </w:p>
+        </w:tc>
+      </w:tr>
+      <w:tr>
+        <w:trPr>
+          <w:cantSplit w:val="true"/>
+        </w:trPr>
+        <w:tc>
+          <w:tcPr>
+            <w:tcW w:type="dxa" w:w="2041"/>
+          </w:tcPr>
+          <w:p>
+            <w:pPr>
+              <w:spacing w:after="0"/>
+            </w:pPr>
+            <w:r>
+              <w:rPr>
+                <w:b/>
+                <w:i w:val="0"/>
+                <w:sz w:val="20"/>
+              </w:rPr>
+              <w:t xml:space="preserve">Riconnessione e inattività</w:t>
+            </w:r>
+          </w:p>
+        </w:tc>
+        <w:tc>
+          <w:tcPr>
+            <w:tcW w:type="dxa" w:w="6576"/>
+          </w:tcPr>
+          <w:p>
+            <w:pPr>
+              <w:spacing w:after="0"/>
+            </w:pPr>
+            <w:r>
+              <w:rPr>
+                <w:b w:val="0"/>
+                <w:i w:val="0"/>
+                <w:sz w:val="20"/>
+              </w:rPr>
+              <w:t xml:space="preserve">Dopo 10 minuti senza attività i client si disconnettono (così il server può spegnersi) e riprendono da soli alla prima interazione. Fa eccezione lo schermo al tavolo, che resta sempre connesso.</w:t>
+            </w:r>
+          </w:p>
+        </w:tc>
+        <w:tc>
+          <w:tcPr>
+            <w:tcW w:type="dxa" w:w="1020"/>
+          </w:tcPr>
+          <w:p>
+            <w:pPr>
+              <w:spacing w:after="0"/>
+              <w:jc w:val="center"/>
+            </w:pPr>
+            <w:r>
+              <w:rPr>
+                <w:b w:val="0"/>
+                <w:i w:val="0"/>
+                <w:color w:val="555560"/>
+                <w:sz w:val="18"/>
+              </w:rPr>
+              <w:t xml:space="preserve">Tutti</w:t>
+            </w:r>
+          </w:p>
+        </w:tc>
+      </w:tr>
+      <w:tr>
+        <w:trPr>
+          <w:cantSplit w:val="true"/>
+        </w:trPr>
+        <w:tc>
+          <w:tcPr>
+            <w:tcW w:type="dxa" w:w="2041"/>
+            <w:shd w:val="clear" w:color="auto" w:fill="F8F6FD"/>
+          </w:tcPr>
+          <w:p>
+            <w:pPr>
+              <w:spacing w:after="0"/>
+            </w:pPr>
+            <w:r>
+              <w:rPr>
+                <w:b/>
+                <w:i w:val="0"/>
+                <w:sz w:val="20"/>
+              </w:rPr>
+              <w:t xml:space="preserve">Pulizia delle stanze</w:t>
+            </w:r>
+          </w:p>
+        </w:tc>
+        <w:tc>
+          <w:tcPr>
+            <w:tcW w:type="dxa" w:w="6576"/>
+            <w:shd w:val="clear" w:color="auto" w:fill="F8F6FD"/>
+          </w:tcPr>
+          <w:p>
+            <w:pPr>
+              <w:spacing w:after="0"/>
+            </w:pPr>
+            <w:r>
+              <w:rPr>
+                <w:b w:val="0"/>
+                <w:i w:val="0"/>
+                <w:sz w:val="20"/>
+              </w:rPr>
+              <w:t xml:space="preserve">Le stanze inattive da 90 giorni vengono eliminate dal server, con documenti e immagini.</w:t>
+            </w:r>
+          </w:p>
+        </w:tc>
+        <w:tc>
+          <w:tcPr>
+            <w:tcW w:type="dxa" w:w="1020"/>
+            <w:shd w:val="clear" w:color="auto" w:fill="F8F6FD"/>
+          </w:tcPr>
+          <w:p>
+            <w:pPr>
+              <w:spacing w:after="0"/>
+              <w:jc w:val="center"/>
+            </w:pPr>
+            <w:r>
+              <w:rPr>
+                <w:b w:val="0"/>
+                <w:i w:val="0"/>
+                <w:color w:val="555560"/>
+                <w:sz w:val="18"/>
+              </w:rPr>
+              <w:t xml:space="preserve">Server</w:t>
             </w:r>
           </w:p>
         </w:tc>
@@ -910,7 +1099,7 @@
                 <w:i w:val="0"/>
                 <w:sz w:val="20"/>
               </w:rPr>
-              <w:t>Cassetto «Scene»</w:t>
+              <w:t xml:space="preserve">Cassetto «Scene»</w:t>
             </w:r>
           </w:p>
         </w:tc>
@@ -928,7 +1117,7 @@
                 <w:i w:val="0"/>
                 <w:sz w:val="20"/>
               </w:rPr>
-              <w:t>Elenco delle scene nella barra laterale: crea, rinomina, duplica ed elimina. Si apre una scena per prepararla senza disturbare i giocatori.</w:t>
+              <w:t xml:space="preserve">Elenco delle scene nella barra laterale: crea, rinomina, duplica ed elimina. Si apre una scena per prepararla senza disturbare i giocatori.</w:t>
             </w:r>
           </w:p>
         </w:tc>
@@ -948,7 +1137,7 @@
                 <w:color w:val="5B44B8"/>
                 <w:sz w:val="18"/>
               </w:rPr>
-              <w:t>Solo GM</w:t>
+              <w:t xml:space="preserve">Solo GM</w:t>
             </w:r>
           </w:p>
         </w:tc>
@@ -972,7 +1161,7 @@
                 <w:i w:val="0"/>
                 <w:sz w:val="20"/>
               </w:rPr>
-              <w:t>Banner di preparazione</w:t>
+              <w:t xml:space="preserve">Banner di preparazione</w:t>
             </w:r>
           </w:p>
         </w:tc>
@@ -991,7 +1180,7 @@
                 <w:i w:val="0"/>
                 <w:sz w:val="20"/>
               </w:rPr>
-              <w:t>Quando guarda una scena diversa da quella dei giocatori, il GM vede un avviso con il pulsante «Torna ai giocatori».</w:t>
+              <w:t xml:space="preserve">Quando guarda una scena diversa da quella dei giocatori, il GM vede un avviso con il pulsante «Torna ai giocatori».</w:t>
             </w:r>
           </w:p>
         </w:tc>
@@ -1012,7 +1201,7 @@
                 <w:color w:val="5B44B8"/>
                 <w:sz w:val="18"/>
               </w:rPr>
-              <w:t>Solo GM</w:t>
+              <w:t xml:space="preserve">Solo GM</w:t>
             </w:r>
           </w:p>
         </w:tc>
@@ -1035,7 +1224,7 @@
                 <w:i w:val="0"/>
                 <w:sz w:val="20"/>
               </w:rPr>
-              <w:t>Sposta qui il gruppo</w:t>
+              <w:t xml:space="preserve">Sposta qui il gruppo</w:t>
             </w:r>
           </w:p>
         </w:tc>
@@ -1053,7 +1242,7 @@
                 <w:i w:val="0"/>
                 <w:sz w:val="20"/>
               </w:rPr>
-              <w:t>Porta tutti i giocatori nella scena scelta, senza ricaricare la pagina; i giocatori entrano solo nella scena attiva e vengono scollegati dalla vecchia.</w:t>
+              <w:t xml:space="preserve">Porta tutti i giocatori nella scena scelta, senza ricaricare la pagina; i giocatori entrano solo nella scena attiva e vengono scollegati dalla vecchia.</w:t>
             </w:r>
           </w:p>
         </w:tc>
@@ -1073,7 +1262,7 @@
                 <w:color w:val="5B44B8"/>
                 <w:sz w:val="18"/>
               </w:rPr>
-              <w:t>Solo GM</w:t>
+              <w:t xml:space="preserve">Solo GM</w:t>
             </w:r>
           </w:p>
         </w:tc>
@@ -1097,7 +1286,7 @@
                 <w:i w:val="0"/>
                 <w:sz w:val="20"/>
               </w:rPr>
-              <w:t>Duplica scena</w:t>
+              <w:t xml:space="preserve">Duplica scena</w:t>
             </w:r>
           </w:p>
         </w:tc>
@@ -1116,7 +1305,7 @@
                 <w:i w:val="0"/>
                 <w:sz w:val="20"/>
               </w:rPr>
-              <w:t>Copia oggetti, impostazioni e parti nascoste in una nuova scena, per riusare un'ambientazione.</w:t>
+              <w:t xml:space="preserve">Copia oggetti, impostazioni e parti nascoste in una nuova scena, per riusare un'ambientazione.</w:t>
             </w:r>
           </w:p>
         </w:tc>
@@ -1137,7 +1326,7 @@
                 <w:color w:val="5B44B8"/>
                 <w:sz w:val="18"/>
               </w:rPr>
-              <w:t>Solo GM</w:t>
+              <w:t xml:space="preserve">Solo GM</w:t>
             </w:r>
           </w:p>
         </w:tc>
@@ -1160,7 +1349,7 @@
                 <w:i w:val="0"/>
                 <w:sz w:val="20"/>
               </w:rPr>
-              <w:t>Dati separati per scena</w:t>
+              <w:t xml:space="preserve">Dati separati per scena</w:t>
             </w:r>
           </w:p>
         </w:tc>
@@ -1178,7 +1367,7 @@
                 <w:i w:val="0"/>
                 <w:sz w:val="20"/>
               </w:rPr>
-              <w:t>Ogni scena ha i propri oggetti, griglia, terreno, muri, registro dei tiri e turni; anche la memoria delle zone esplorate è separata.</w:t>
+              <w:t xml:space="preserve">Ogni scena ha i propri oggetti, griglia, terreno, muri, registro dei tiri e turni; anche la memoria delle zone esplorate è separata.</w:t>
             </w:r>
           </w:p>
         </w:tc>
@@ -1198,7 +1387,7 @@
                 <w:color w:val="555560"/>
                 <w:sz w:val="18"/>
               </w:rPr>
-              <w:t>Tutti</w:t>
+              <w:t xml:space="preserve">Tutti</w:t>
             </w:r>
           </w:p>
         </w:tc>
@@ -1331,7 +1520,7 @@
                 <w:i w:val="0"/>
                 <w:sz w:val="20"/>
               </w:rPr>
-              <w:t>Canvas infinito</w:t>
+              <w:t xml:space="preserve">Canvas infinito</w:t>
             </w:r>
           </w:p>
         </w:tc>
@@ -1349,7 +1538,7 @@
                 <w:i w:val="0"/>
                 <w:sz w:val="20"/>
               </w:rPr>
-              <w:t>Spostamento della vista con trascinamento (strumento Mano o barra spaziatrice) e zoom con rotella o pinch; «Adatta al contenuto» e zoom al 100%.</w:t>
+              <w:t xml:space="preserve">Spostamento della vista con trascinamento (strumento Mano o barra spaziatrice) e zoom con rotella o pinch; «Adatta al contenuto» e zoom al 100%.</w:t>
             </w:r>
           </w:p>
         </w:tc>
@@ -1369,7 +1558,7 @@
                 <w:color w:val="555560"/>
                 <w:sz w:val="18"/>
               </w:rPr>
-              <w:t>Tutti</w:t>
+              <w:t xml:space="preserve">Tutti</w:t>
             </w:r>
           </w:p>
         </w:tc>
@@ -1393,7 +1582,7 @@
                 <w:i w:val="0"/>
                 <w:sz w:val="20"/>
               </w:rPr>
-              <w:t>Livelli</w:t>
+              <w:t xml:space="preserve">Livelli</w:t>
             </w:r>
           </w:p>
         </w:tc>
@@ -1412,7 +1601,7 @@
                 <w:i w:val="0"/>
                 <w:sz w:val="20"/>
               </w:rPr>
-              <w:t>Dal basso: terreno, percorsi, mappa, griglia, muri e porte, token, luce e visione, nebbia, disegni. I livelli terreno, percorsi e mappa sono modificabili solo dal GM.</w:t>
+              <w:t xml:space="preserve">Dal basso: terreno, percorsi, mappa, griglia, muri e porte, token, tetti, luce e visione, nebbia, disegni. I livelli terreno, percorsi e mappa sono modificabili solo dal GM.</w:t>
             </w:r>
           </w:p>
         </w:tc>
@@ -1433,7 +1622,7 @@
                 <w:color w:val="555560"/>
                 <w:sz w:val="18"/>
               </w:rPr>
-              <w:t>Tutti</w:t>
+              <w:t xml:space="preserve">Tutti</w:t>
             </w:r>
           </w:p>
         </w:tc>
@@ -1456,7 +1645,7 @@
                 <w:i w:val="0"/>
                 <w:sz w:val="20"/>
               </w:rPr>
-              <w:t>Selezione e trasformazione</w:t>
+              <w:t xml:space="preserve">Selezione e trasformazione</w:t>
             </w:r>
           </w:p>
         </w:tc>
@@ -1474,7 +1663,7 @@
                 <w:i w:val="0"/>
                 <w:sz w:val="20"/>
               </w:rPr>
-              <w:t>Selezione singola o a riquadro (con Maiusc si aggiunge), spostamento, ridimensionamento, rotazione, eliminazione e ordine all'interno del livello (porta avanti / manda indietro).</w:t>
+              <w:t xml:space="preserve">Selezione singola o a riquadro (con Maiusc si aggiunge), spostamento, ridimensionamento, rotazione, eliminazione e ordine all'interno del livello (porta avanti / manda indietro).</w:t>
             </w:r>
           </w:p>
         </w:tc>
@@ -1494,7 +1683,7 @@
                 <w:color w:val="555560"/>
                 <w:sz w:val="18"/>
               </w:rPr>
-              <w:t>Tutti</w:t>
+              <w:t xml:space="preserve">Tutti</w:t>
             </w:r>
           </w:p>
         </w:tc>
@@ -1518,7 +1707,7 @@
                 <w:i w:val="0"/>
                 <w:sz w:val="20"/>
               </w:rPr>
-              <w:t>Blocco degli oggetti</w:t>
+              <w:t xml:space="preserve">Duplica</w:t>
             </w:r>
           </w:p>
         </w:tc>
@@ -1537,7 +1726,7 @@
                 <w:i w:val="0"/>
                 <w:sz w:val="20"/>
               </w:rPr>
-              <w:t>Il GM può bloccare qualsiasi oggetto: finché è bloccato nessuno può spostarlo o cancellarlo.</w:t>
+              <w:t xml:space="preserve">Ctrl+D o il pulsante «Duplica» copiano la selezione una casella più in là e selezionano le copie. I token copiati prendono il primo nome numerato libero («Goblin 2», «Goblin 3»…); le copie di oggetti nascosti o in incognito restano tali.</w:t>
             </w:r>
           </w:p>
         </w:tc>
@@ -1553,12 +1742,12 @@
             </w:pPr>
             <w:r>
               <w:rPr>
-                <w:b/>
-                <w:i w:val="0"/>
-                <w:color w:val="5B44B8"/>
+                <w:b w:val="0"/>
+                <w:i w:val="0"/>
+                <w:color w:val="555560"/>
                 <w:sz w:val="18"/>
               </w:rPr>
-              <w:t>Solo GM</w:t>
+              <w:t xml:space="preserve">Tutti</w:t>
             </w:r>
           </w:p>
         </w:tc>
@@ -1581,7 +1770,7 @@
                 <w:i w:val="0"/>
                 <w:sz w:val="20"/>
               </w:rPr>
-              <w:t>Annulla e ripeti</w:t>
+              <w:t xml:space="preserve">Blocco degli oggetti</w:t>
             </w:r>
           </w:p>
         </w:tc>
@@ -1599,7 +1788,7 @@
                 <w:i w:val="0"/>
                 <w:sz w:val="20"/>
               </w:rPr>
-              <w:t>Ogni azione dell'utente è un solo passo di annulla (Ctrl+Z / Ctrl+Maiusc+Z), anche quando tocca più elementi.</w:t>
+              <w:t xml:space="preserve">Il GM può bloccare qualsiasi oggetto: finché è bloccato nessuno può spostarlo o cancellarlo.</w:t>
             </w:r>
           </w:p>
         </w:tc>
@@ -1614,12 +1803,12 @@
             </w:pPr>
             <w:r>
               <w:rPr>
-                <w:b w:val="0"/>
-                <w:i w:val="0"/>
-                <w:color w:val="555560"/>
+                <w:b/>
+                <w:i w:val="0"/>
+                <w:color w:val="5B44B8"/>
                 <w:sz w:val="18"/>
               </w:rPr>
-              <w:t>Tutti</w:t>
+              <w:t xml:space="preserve">Solo GM</w:t>
             </w:r>
           </w:p>
         </w:tc>
@@ -1643,7 +1832,7 @@
                 <w:i w:val="0"/>
                 <w:sz w:val="20"/>
               </w:rPr>
-              <w:t>Immagini sulla lavagna</w:t>
+              <w:t xml:space="preserve">Annulla e ripeti</w:t>
             </w:r>
           </w:p>
         </w:tc>
@@ -1662,7 +1851,7 @@
                 <w:i w:val="0"/>
                 <w:sz w:val="20"/>
               </w:rPr>
-              <w:t>Si aggiungono con il pulsante della barra, trascinandole o incollandole (PNG, JPEG, WebP, GIF, fino a 20 MB). Quelle del GM vanno sul livello mappa; quelle dei giocatori tra i disegni.</w:t>
+              <w:t xml:space="preserve">Ogni azione dell'utente è un solo passo di annulla (Ctrl+Z / Ctrl+Maiusc+Z), anche quando tocca più elementi.</w:t>
             </w:r>
           </w:p>
         </w:tc>
@@ -1683,7 +1872,7 @@
                 <w:color w:val="555560"/>
                 <w:sz w:val="18"/>
               </w:rPr>
-              <w:t>Tutti</w:t>
+              <w:t xml:space="preserve">Tutti</w:t>
             </w:r>
           </w:p>
         </w:tc>
@@ -1706,7 +1895,7 @@
                 <w:i w:val="0"/>
                 <w:sz w:val="20"/>
               </w:rPr>
-              <w:t>Ping</w:t>
+              <w:t xml:space="preserve">Barra degli strumenti</w:t>
             </w:r>
           </w:p>
         </w:tc>
@@ -1724,7 +1913,7 @@
                 <w:i w:val="0"/>
                 <w:sz w:val="20"/>
               </w:rPr>
-              <w:t>Pressione prolungata su un punto: un cerchio animato visibile a tutti. Se il ping cade fuori dalla propria vista, una freccia sul bordo dello schermo indica la direzione e un clic centra la vista.</w:t>
+              <w:t xml:space="preserve">Gli strumenti simili stanno in gruppi a comparsa (Disegno per tutti, Mappa e Visibilità per il GM): il pulsante di un gruppo mostra l'ultimo strumento usato e le scorciatoie funzionano anche a gruppo chiuso. Se lo schermo è basso, la barra scorre.</w:t>
             </w:r>
           </w:p>
         </w:tc>
@@ -1744,7 +1933,7 @@
                 <w:color w:val="555560"/>
                 <w:sz w:val="18"/>
               </w:rPr>
-              <w:t>Tutti</w:t>
+              <w:t xml:space="preserve">Tutti</w:t>
             </w:r>
           </w:p>
         </w:tc>
@@ -1768,7 +1957,7 @@
                 <w:i w:val="0"/>
                 <w:sz w:val="20"/>
               </w:rPr>
-              <w:t>Porta qui i giocatori</w:t>
+              <w:t xml:space="preserve">Immagini sulla lavagna</w:t>
             </w:r>
           </w:p>
         </w:tc>
@@ -1787,7 +1976,7 @@
                 <w:i w:val="0"/>
                 <w:sz w:val="20"/>
               </w:rPr>
-              <w:t>Un pulsante (o Maiusc + pressione prolungata) centra la vista di tutti i giocatori sul punto e sullo zoom che sta guardando il GM, con una breve animazione.</w:t>
+              <w:t xml:space="preserve">Si aggiungono con il pulsante della barra, trascinandole o incollandole (PNG, JPEG, WebP, GIF, fino a 20 MB). Quelle del GM vanno sul livello mappa; quelle dei giocatori tra i disegni.</w:t>
             </w:r>
           </w:p>
         </w:tc>
@@ -1803,12 +1992,198 @@
             </w:pPr>
             <w:r>
               <w:rPr>
+                <w:b w:val="0"/>
+                <w:i w:val="0"/>
+                <w:color w:val="555560"/>
+                <w:sz w:val="18"/>
+              </w:rPr>
+              <w:t xml:space="preserve">Tutti</w:t>
+            </w:r>
+          </w:p>
+        </w:tc>
+      </w:tr>
+      <w:tr>
+        <w:trPr>
+          <w:cantSplit w:val="true"/>
+        </w:trPr>
+        <w:tc>
+          <w:tcPr>
+            <w:tcW w:type="dxa" w:w="2041"/>
+          </w:tcPr>
+          <w:p>
+            <w:pPr>
+              <w:spacing w:after="0"/>
+            </w:pPr>
+            <w:r>
+              <w:rPr>
+                <w:b/>
+                <w:i w:val="0"/>
+                <w:sz w:val="20"/>
+              </w:rPr>
+              <w:t xml:space="preserve">Ping</w:t>
+            </w:r>
+          </w:p>
+        </w:tc>
+        <w:tc>
+          <w:tcPr>
+            <w:tcW w:type="dxa" w:w="6576"/>
+          </w:tcPr>
+          <w:p>
+            <w:pPr>
+              <w:spacing w:after="0"/>
+            </w:pPr>
+            <w:r>
+              <w:rPr>
+                <w:b w:val="0"/>
+                <w:i w:val="0"/>
+                <w:sz w:val="20"/>
+              </w:rPr>
+              <w:t xml:space="preserve">Pressione prolungata su un punto: un cerchio animato visibile a tutti. Se il ping cade fuori dalla propria vista, una freccia sul bordo dello schermo indica la direzione e un clic centra la vista.</w:t>
+            </w:r>
+          </w:p>
+        </w:tc>
+        <w:tc>
+          <w:tcPr>
+            <w:tcW w:type="dxa" w:w="1020"/>
+          </w:tcPr>
+          <w:p>
+            <w:pPr>
+              <w:spacing w:after="0"/>
+              <w:jc w:val="center"/>
+            </w:pPr>
+            <w:r>
+              <w:rPr>
+                <w:b w:val="0"/>
+                <w:i w:val="0"/>
+                <w:color w:val="555560"/>
+                <w:sz w:val="18"/>
+              </w:rPr>
+              <w:t xml:space="preserve">Tutti</w:t>
+            </w:r>
+          </w:p>
+        </w:tc>
+      </w:tr>
+      <w:tr>
+        <w:trPr>
+          <w:cantSplit w:val="true"/>
+        </w:trPr>
+        <w:tc>
+          <w:tcPr>
+            <w:tcW w:type="dxa" w:w="2041"/>
+            <w:shd w:val="clear" w:color="auto" w:fill="F8F6FD"/>
+          </w:tcPr>
+          <w:p>
+            <w:pPr>
+              <w:spacing w:after="0"/>
+            </w:pPr>
+            <w:r>
+              <w:rPr>
+                <w:b/>
+                <w:i w:val="0"/>
+                <w:sz w:val="20"/>
+              </w:rPr>
+              <w:t xml:space="preserve">Puntatore laser</w:t>
+            </w:r>
+          </w:p>
+        </w:tc>
+        <w:tc>
+          <w:tcPr>
+            <w:tcW w:type="dxa" w:w="6576"/>
+            <w:shd w:val="clear" w:color="auto" w:fill="F8F6FD"/>
+          </w:tcPr>
+          <w:p>
+            <w:pPr>
+              <w:spacing w:after="0"/>
+            </w:pPr>
+            <w:r>
+              <w:rPr>
+                <w:b w:val="0"/>
+                <w:i w:val="0"/>
+                <w:sz w:val="20"/>
+              </w:rPr>
+              <w:t xml:space="preserve">Strumento Puntatore laser (Q): trascinando si lascia una scia nel proprio colore che tutti vedono in tempo reale e che svanisce in poco più di un secondo, senza lasciare niente sulla lavagna né nello storico.</w:t>
+            </w:r>
+          </w:p>
+        </w:tc>
+        <w:tc>
+          <w:tcPr>
+            <w:tcW w:type="dxa" w:w="1020"/>
+            <w:shd w:val="clear" w:color="auto" w:fill="F8F6FD"/>
+          </w:tcPr>
+          <w:p>
+            <w:pPr>
+              <w:spacing w:after="0"/>
+              <w:jc w:val="center"/>
+            </w:pPr>
+            <w:r>
+              <w:rPr>
+                <w:b w:val="0"/>
+                <w:i w:val="0"/>
+                <w:color w:val="555560"/>
+                <w:sz w:val="18"/>
+              </w:rPr>
+              <w:t xml:space="preserve">Tutti</w:t>
+            </w:r>
+          </w:p>
+        </w:tc>
+      </w:tr>
+      <w:tr>
+        <w:trPr>
+          <w:cantSplit w:val="true"/>
+        </w:trPr>
+        <w:tc>
+          <w:tcPr>
+            <w:tcW w:type="dxa" w:w="2041"/>
+          </w:tcPr>
+          <w:p>
+            <w:pPr>
+              <w:spacing w:after="0"/>
+            </w:pPr>
+            <w:r>
+              <w:rPr>
+                <w:b/>
+                <w:i w:val="0"/>
+                <w:sz w:val="20"/>
+              </w:rPr>
+              <w:t xml:space="preserve">Porta qui i giocatori</w:t>
+            </w:r>
+          </w:p>
+        </w:tc>
+        <w:tc>
+          <w:tcPr>
+            <w:tcW w:type="dxa" w:w="6576"/>
+          </w:tcPr>
+          <w:p>
+            <w:pPr>
+              <w:spacing w:after="0"/>
+            </w:pPr>
+            <w:r>
+              <w:rPr>
+                <w:b w:val="0"/>
+                <w:i w:val="0"/>
+                <w:sz w:val="20"/>
+              </w:rPr>
+              <w:t xml:space="preserve">Un pulsante (o Maiusc + pressione prolungata) centra la vista di tutti i giocatori sul punto e sullo zoom che sta guardando il GM, con una breve animazione.</w:t>
+            </w:r>
+          </w:p>
+        </w:tc>
+        <w:tc>
+          <w:tcPr>
+            <w:tcW w:type="dxa" w:w="1020"/>
+          </w:tcPr>
+          <w:p>
+            <w:pPr>
+              <w:spacing w:after="0"/>
+              <w:jc w:val="center"/>
+            </w:pPr>
+            <w:r>
+              <w:rPr>
                 <w:b/>
                 <w:i w:val="0"/>
                 <w:color w:val="5B44B8"/>
                 <w:sz w:val="18"/>
               </w:rPr>
-              <w:t>Solo GM</w:t>
+              <w:t xml:space="preserve">Solo GM</w:t>
             </w:r>
           </w:p>
         </w:tc>
@@ -1941,7 +2316,7 @@
                 <w:i w:val="0"/>
                 <w:sz w:val="20"/>
               </w:rPr>
-              <w:t>Matita, linea, rettangolo, ellisse</w:t>
+              <w:t xml:space="preserve">Matita, linea, rettangolo, ellisse</w:t>
             </w:r>
           </w:p>
         </w:tc>
@@ -1959,7 +2334,7 @@
                 <w:i w:val="0"/>
                 <w:sz w:val="20"/>
               </w:rPr>
-              <w:t>Disegno a mano libera e forme, con tavolozza di 8 colori, 4 spessori e riempimento opzionale.</w:t>
+              <w:t xml:space="preserve">Disegno a mano libera e forme, con tavolozza di 8 colori, 4 spessori e riempimento opzionale.</w:t>
             </w:r>
           </w:p>
         </w:tc>
@@ -1979,7 +2354,7 @@
                 <w:color w:val="555560"/>
                 <w:sz w:val="18"/>
               </w:rPr>
-              <w:t>Tutti</w:t>
+              <w:t xml:space="preserve">Tutti</w:t>
             </w:r>
           </w:p>
         </w:tc>
@@ -2003,7 +2378,7 @@
                 <w:i w:val="0"/>
                 <w:sz w:val="20"/>
               </w:rPr>
-              <w:t>Testo</w:t>
+              <w:t xml:space="preserve">Testo</w:t>
             </w:r>
           </w:p>
         </w:tc>
@@ -2022,7 +2397,7 @@
                 <w:i w:val="0"/>
                 <w:sz w:val="20"/>
               </w:rPr>
-              <w:t>Caselle di testo modificabili sul posto, con dimensione e colore.</w:t>
+              <w:t xml:space="preserve">Caselle di testo modificabili sul posto, con dimensione e colore.</w:t>
             </w:r>
           </w:p>
         </w:tc>
@@ -2043,7 +2418,7 @@
                 <w:color w:val="555560"/>
                 <w:sz w:val="18"/>
               </w:rPr>
-              <w:t>Tutti</w:t>
+              <w:t xml:space="preserve">Tutti</w:t>
             </w:r>
           </w:p>
         </w:tc>
@@ -2066,7 +2441,7 @@
                 <w:i w:val="0"/>
                 <w:sz w:val="20"/>
               </w:rPr>
-              <w:t>Gomma</w:t>
+              <w:t xml:space="preserve">Connettori</w:t>
             </w:r>
           </w:p>
         </w:tc>
@@ -2084,7 +2459,7 @@
                 <w:i w:val="0"/>
                 <w:sz w:val="20"/>
               </w:rPr>
-              <w:t>Cancella gli oggetti; per il GM anche muri e porte, in un solo passo di annulla.</w:t>
+              <w:t xml:space="preserve">Strumento Collega (C): trascinando da un oggetto a un altro nasce una freccia che li segue quando si spostano, con etichetta, colore, punta e verso modificabili (bacheche investigative, legami tra fazioni). Se uno dei due oggetti è nascosto il connettore non si vede; cancellandoli sparisce anche lui.</w:t>
             </w:r>
           </w:p>
         </w:tc>
@@ -2104,7 +2479,71 @@
                 <w:color w:val="555560"/>
                 <w:sz w:val="18"/>
               </w:rPr>
-              <w:t>Tutti</w:t>
+              <w:t xml:space="preserve">Tutti</w:t>
+            </w:r>
+          </w:p>
+        </w:tc>
+      </w:tr>
+      <w:tr>
+        <w:trPr>
+          <w:cantSplit w:val="true"/>
+        </w:trPr>
+        <w:tc>
+          <w:tcPr>
+            <w:tcW w:type="dxa" w:w="2041"/>
+            <w:shd w:val="clear" w:color="auto" w:fill="F8F6FD"/>
+          </w:tcPr>
+          <w:p>
+            <w:pPr>
+              <w:spacing w:after="0"/>
+            </w:pPr>
+            <w:r>
+              <w:rPr>
+                <w:b/>
+                <w:i w:val="0"/>
+                <w:sz w:val="20"/>
+              </w:rPr>
+              <w:t xml:space="preserve">Gomma</w:t>
+            </w:r>
+          </w:p>
+        </w:tc>
+        <w:tc>
+          <w:tcPr>
+            <w:tcW w:type="dxa" w:w="6576"/>
+            <w:shd w:val="clear" w:color="auto" w:fill="F8F6FD"/>
+          </w:tcPr>
+          <w:p>
+            <w:pPr>
+              <w:spacing w:after="0"/>
+            </w:pPr>
+            <w:r>
+              <w:rPr>
+                <w:b w:val="0"/>
+                <w:i w:val="0"/>
+                <w:sz w:val="20"/>
+              </w:rPr>
+              <w:t xml:space="preserve">Cancella gli oggetti; per il GM anche muri e porte, in un solo passo di annulla.</w:t>
+            </w:r>
+          </w:p>
+        </w:tc>
+        <w:tc>
+          <w:tcPr>
+            <w:tcW w:type="dxa" w:w="1020"/>
+            <w:shd w:val="clear" w:color="auto" w:fill="F8F6FD"/>
+          </w:tcPr>
+          <w:p>
+            <w:pPr>
+              <w:spacing w:after="0"/>
+              <w:jc w:val="center"/>
+            </w:pPr>
+            <w:r>
+              <w:rPr>
+                <w:b w:val="0"/>
+                <w:i w:val="0"/>
+                <w:color w:val="555560"/>
+                <w:sz w:val="18"/>
+              </w:rPr>
+              <w:t xml:space="preserve">Tutti</w:t>
             </w:r>
           </w:p>
         </w:tc>
@@ -2237,7 +2676,7 @@
                 <w:i w:val="0"/>
                 <w:sz w:val="20"/>
               </w:rPr>
-              <w:t>Griglia quadrata o esagonale</w:t>
+              <w:t xml:space="preserve">Griglia quadrata o esagonale</w:t>
             </w:r>
           </w:p>
         </w:tc>
@@ -2255,7 +2694,7 @@
                 <w:i w:val="0"/>
                 <w:sz w:val="20"/>
               </w:rPr>
-              <w:t>Attivabile per scena; gli esagoni possono avere un vertice in alto (a punta) o un lato (piatta). Dimensione e offset regolabili.</w:t>
+              <w:t xml:space="preserve">Attivabile per scena; gli esagoni possono avere un vertice in alto (a punta) o un lato (piatta). Dimensione e offset regolabili.</w:t>
             </w:r>
           </w:p>
         </w:tc>
@@ -2275,7 +2714,7 @@
                 <w:color w:val="5B44B8"/>
                 <w:sz w:val="18"/>
               </w:rPr>
-              <w:t>Solo GM</w:t>
+              <w:t xml:space="preserve">Solo GM</w:t>
             </w:r>
           </w:p>
         </w:tc>
@@ -2299,7 +2738,7 @@
                 <w:i w:val="0"/>
                 <w:sz w:val="20"/>
               </w:rPr>
-              <w:t>Calibrazione</w:t>
+              <w:t xml:space="preserve">Calibrazione</w:t>
             </w:r>
           </w:p>
         </w:tc>
@@ -2318,7 +2757,7 @@
                 <w:i w:val="0"/>
                 <w:sz w:val="20"/>
               </w:rPr>
-              <w:t>Si traccia un riquadro su una casella della mappa importata (o attorno a un esagono) e la griglia ne prende misura e posizione.</w:t>
+              <w:t xml:space="preserve">Si traccia un riquadro su una casella della mappa importata (o attorno a un esagono) e la griglia ne prende misura e posizione.</w:t>
             </w:r>
           </w:p>
         </w:tc>
@@ -2339,7 +2778,7 @@
                 <w:color w:val="5B44B8"/>
                 <w:sz w:val="18"/>
               </w:rPr>
-              <w:t>Solo GM</w:t>
+              <w:t xml:space="preserve">Solo GM</w:t>
             </w:r>
           </w:p>
         </w:tc>
@@ -2362,7 +2801,7 @@
                 <w:i w:val="0"/>
                 <w:sz w:val="20"/>
               </w:rPr>
-              <w:t>Aggancio alla griglia</w:t>
+              <w:t xml:space="preserve">Aggancio alla griglia</w:t>
             </w:r>
           </w:p>
         </w:tc>
@@ -2380,7 +2819,7 @@
                 <w:i w:val="0"/>
                 <w:sz w:val="20"/>
               </w:rPr>
-              <w:t>I token si agganciano al centro delle caselle (Alt per muoverli liberi); muri e righello usano gli incroci o i centri.</w:t>
+              <w:t xml:space="preserve">I token si agganciano al centro delle caselle (Alt per muoverli liberi); muri e righello usano gli incroci o i centri.</w:t>
             </w:r>
           </w:p>
         </w:tc>
@@ -2400,7 +2839,7 @@
                 <w:color w:val="555560"/>
                 <w:sz w:val="18"/>
               </w:rPr>
-              <w:t>Tutti</w:t>
+              <w:t xml:space="preserve">Tutti</w:t>
             </w:r>
           </w:p>
         </w:tc>
@@ -2424,7 +2863,7 @@
                 <w:i w:val="0"/>
                 <w:sz w:val="20"/>
               </w:rPr>
-              <w:t>Righello</w:t>
+              <w:t xml:space="preserve">Righello</w:t>
             </w:r>
           </w:p>
         </w:tc>
@@ -2443,7 +2882,7 @@
                 <w:i w:val="0"/>
                 <w:sz w:val="20"/>
               </w:rPr>
-              <w:t>Strumento Righello (M): si trascina per misurare, con Spazio si aggiungono tappe, Esc annulla. Gli altri vedono la misura in tempo reale nel colore di chi la traccia.</w:t>
+              <w:t xml:space="preserve">Strumento Righello (M): si trascina per misurare, con Spazio si aggiungono tappe, Esc annulla. Gli altri vedono la misura in tempo reale nel colore di chi la traccia. Tiene conto della quota dei token agli estremi.</w:t>
             </w:r>
           </w:p>
         </w:tc>
@@ -2464,7 +2903,7 @@
                 <w:color w:val="555560"/>
                 <w:sz w:val="18"/>
               </w:rPr>
-              <w:t>Tutti</w:t>
+              <w:t xml:space="preserve">Tutti</w:t>
             </w:r>
           </w:p>
         </w:tc>
@@ -2487,7 +2926,7 @@
                 <w:i w:val="0"/>
                 <w:sz w:val="20"/>
               </w:rPr>
-              <w:t>Scala e diagonali</w:t>
+              <w:t xml:space="preserve">Scala e diagonali</w:t>
             </w:r>
           </w:p>
         </w:tc>
@@ -2505,7 +2944,7 @@
                 <w:i w:val="0"/>
                 <w:sz w:val="20"/>
               </w:rPr>
-              <w:t>Una casella vale una misura configurabile (5 ft, 1,5 m…); le diagonali si contano «1 per diagonale» (5e), alternando 1-2 (3.5 / Pathfinder) o in linea retta.</w:t>
+              <w:t xml:space="preserve">Una casella vale una misura configurabile (5 ft, 1,5 m…); le diagonali si contano «1 per diagonale» (5e), alternando 1-2 (3.5 / Pathfinder) o in linea retta.</w:t>
             </w:r>
           </w:p>
         </w:tc>
@@ -2525,7 +2964,7 @@
                 <w:color w:val="5B44B8"/>
                 <w:sz w:val="18"/>
               </w:rPr>
-              <w:t>Solo GM</w:t>
+              <w:t xml:space="preserve">Solo GM</w:t>
             </w:r>
           </w:p>
         </w:tc>
@@ -2549,7 +2988,7 @@
                 <w:i w:val="0"/>
                 <w:sz w:val="20"/>
               </w:rPr>
-              <w:t>Distanza mentre si trascina</w:t>
+              <w:t xml:space="preserve">Distanza mentre si trascina</w:t>
             </w:r>
           </w:p>
         </w:tc>
@@ -2568,7 +3007,7 @@
                 <w:i w:val="0"/>
                 <w:sz w:val="20"/>
               </w:rPr>
-              <w:t>Spostando un token compare la distanza percorsa dalla casella di partenza, anche con tappe intermedie (Spazio). Per i token nascosti non viene mostrata agli altri.</w:t>
+              <w:t xml:space="preserve">Spostando un token compare la distanza percorsa dalla casella di partenza, anche con tappe intermedie (Spazio). Per i token nascosti non viene mostrata agli altri.</w:t>
             </w:r>
           </w:p>
         </w:tc>
@@ -2589,7 +3028,7 @@
                 <w:color w:val="555560"/>
                 <w:sz w:val="18"/>
               </w:rPr>
-              <w:t>Tutti</w:t>
+              <w:t xml:space="preserve">Tutti</w:t>
             </w:r>
           </w:p>
         </w:tc>
@@ -2612,7 +3051,7 @@
                 <w:i w:val="0"/>
                 <w:sz w:val="20"/>
               </w:rPr>
-              <w:t>Sagome d'area</w:t>
+              <w:t xml:space="preserve">Sagome d'area</w:t>
             </w:r>
           </w:p>
         </w:tc>
@@ -2630,7 +3069,7 @@
                 <w:i w:val="0"/>
                 <w:sz w:val="20"/>
               </w:rPr>
-              <w:t>Cerchio, cono, cubo e raggio che evidenziano le caselle coperte e contornano i token toccati, con etichetta di misura e numero di token. Restano visibili a tutti per qualche secondo oppure, con Maiusc al rilascio, si fissano come oggetti da spostare o cancellare.</w:t>
+              <w:t xml:space="preserve">Cerchio, cono, cubo e raggio che evidenziano le caselle coperte e contornano i token toccati, con etichetta di misura e numero di token. Restano visibili a tutti per qualche secondo oppure, con Maiusc al rilascio, si fissano come oggetti da spostare o cancellare.</w:t>
             </w:r>
           </w:p>
         </w:tc>
@@ -2650,7 +3089,7 @@
                 <w:color w:val="555560"/>
                 <w:sz w:val="18"/>
               </w:rPr>
-              <w:t>Tutti</w:t>
+              <w:t xml:space="preserve">Tutti</w:t>
             </w:r>
           </w:p>
         </w:tc>
@@ -2674,7 +3113,7 @@
                 <w:i w:val="0"/>
                 <w:sz w:val="20"/>
               </w:rPr>
-              <w:t>Aure dei token</w:t>
+              <w:t xml:space="preserve">Aure dei token</w:t>
             </w:r>
           </w:p>
         </w:tc>
@@ -2693,7 +3132,7 @@
                 <w:i w:val="0"/>
                 <w:sz w:val="20"/>
               </w:rPr>
-              <w:t>Ogni token può avere un'aura (raggio in caselle dal bordo e colore) visibile a tutti.</w:t>
+              <w:t xml:space="preserve">Ogni token può avere un'aura (raggio in caselle dal bordo e colore) visibile a tutti.</w:t>
             </w:r>
           </w:p>
         </w:tc>
@@ -2714,7 +3153,7 @@
                 <w:color w:val="555560"/>
                 <w:sz w:val="18"/>
               </w:rPr>
-              <w:t>Tutti</w:t>
+              <w:t xml:space="preserve">Tutti</w:t>
             </w:r>
           </w:p>
         </w:tc>
@@ -2847,7 +3286,7 @@
                 <w:i w:val="0"/>
                 <w:sz w:val="20"/>
               </w:rPr>
-              <w:t>Aspetto del token</w:t>
+              <w:t xml:space="preserve">Aspetto del token</w:t>
             </w:r>
           </w:p>
         </w:tc>
@@ -2865,7 +3304,7 @@
                 <w:i w:val="0"/>
                 <w:sz w:val="20"/>
               </w:rPr>
-              <w:t>Cerchio colorato con le iniziali, immagine caricata o sagoma della libreria; nome sotto il token, colore a scelta e cinque taglie (da minuscola a mastodontica).</w:t>
+              <w:t xml:space="preserve">Cerchio colorato con le iniziali, immagine caricata o sagoma della libreria; nome sotto il token, colore a scelta e cinque taglie (da minuscola a mastodontica).</w:t>
             </w:r>
           </w:p>
         </w:tc>
@@ -2885,7 +3324,7 @@
                 <w:color w:val="555560"/>
                 <w:sz w:val="18"/>
               </w:rPr>
-              <w:t>Tutti</w:t>
+              <w:t xml:space="preserve">Tutti</w:t>
             </w:r>
           </w:p>
         </w:tc>
@@ -2909,7 +3348,7 @@
                 <w:i w:val="0"/>
                 <w:sz w:val="20"/>
               </w:rPr>
-              <w:t>Libreria di immagini</w:t>
+              <w:t xml:space="preserve">Libreria di immagini</w:t>
             </w:r>
           </w:p>
         </w:tc>
@@ -2928,7 +3367,7 @@
                 <w:i w:val="0"/>
                 <w:sz w:val="20"/>
               </w:rPr>
-              <w:t>Circa 80 sagome fantasy (personaggi, umanoidi, non morti, bestie, draghi, mostruosità, giganti e altro) con ricerca per nome italiano o inglese, categorie e immagini recenti. Colorate con il colore del token; icone di game-icons.net (CC BY 3.0).</w:t>
+              <w:t xml:space="preserve">Circa 80 sagome fantasy (personaggi, umanoidi, non morti, bestie, draghi, mostruosità, giganti e altro) con ricerca per nome italiano o inglese, categorie e immagini recenti. Colorate con il colore del token; icone di game-icons.net (CC BY 3.0).</w:t>
             </w:r>
           </w:p>
         </w:tc>
@@ -2949,7 +3388,7 @@
                 <w:color w:val="555560"/>
                 <w:sz w:val="18"/>
               </w:rPr>
-              <w:t>Tutti</w:t>
+              <w:t xml:space="preserve">Tutti</w:t>
             </w:r>
           </w:p>
         </w:tc>
@@ -2972,7 +3411,7 @@
                 <w:i w:val="0"/>
                 <w:sz w:val="20"/>
               </w:rPr>
-              <w:t>Carica e ritaglia</w:t>
+              <w:t xml:space="preserve">Carica e ritaglia</w:t>
             </w:r>
           </w:p>
         </w:tc>
@@ -2990,7 +3429,7 @@
                 <w:i w:val="0"/>
                 <w:sz w:val="20"/>
               </w:rPr>
-              <w:t>Un'immagine propria si ritaglia a cerchio (spostamento e zoom) prima del caricamento.</w:t>
+              <w:t xml:space="preserve">Un'immagine propria si ritaglia a cerchio (spostamento e zoom) prima del caricamento.</w:t>
             </w:r>
           </w:p>
         </w:tc>
@@ -3010,7 +3449,7 @@
                 <w:color w:val="555560"/>
                 <w:sz w:val="18"/>
               </w:rPr>
-              <w:t>Tutti</w:t>
+              <w:t xml:space="preserve">Tutti</w:t>
             </w:r>
           </w:p>
         </w:tc>
@@ -3034,7 +3473,7 @@
                 <w:i w:val="0"/>
                 <w:sz w:val="20"/>
               </w:rPr>
-              <w:t>Scheda «Caricati»</w:t>
+              <w:t xml:space="preserve">Scheda «Caricati»</w:t>
             </w:r>
           </w:p>
         </w:tc>
@@ -3053,7 +3492,7 @@
                 <w:i w:val="0"/>
                 <w:sz w:val="20"/>
               </w:rPr>
-              <w:t>Le immagini già presenti nella stanza si riusano con un clic; «Aggiungi alla raccolta» carica un'immagine senza piazzarla, per preparare i token in anticipo.</w:t>
+              <w:t xml:space="preserve">Le immagini già presenti nella stanza si riusano con un clic; «Aggiungi alla raccolta» carica un'immagine senza piazzarla, per preparare i token in anticipo. Il GM può mostrarne una a tutto schermo ai giocatori senza metterla sulla lavagna.</w:t>
             </w:r>
           </w:p>
         </w:tc>
@@ -3074,7 +3513,7 @@
                 <w:color w:val="555560"/>
                 <w:sz w:val="18"/>
               </w:rPr>
-              <w:t>Tutti</w:t>
+              <w:t xml:space="preserve">Tutti</w:t>
             </w:r>
           </w:p>
         </w:tc>
@@ -3097,7 +3536,7 @@
                 <w:i w:val="0"/>
                 <w:sz w:val="20"/>
               </w:rPr>
-              <w:t>Movimento</w:t>
+              <w:t xml:space="preserve">Movimento</w:t>
             </w:r>
           </w:p>
         </w:tc>
@@ -3115,7 +3554,7 @@
                 <w:i w:val="0"/>
                 <w:sz w:val="20"/>
               </w:rPr>
-              <w:t>I giocatori muovono qualunque token non bloccato; per i token il GM può escludere i muri tenendo premuto Alt, mentre per i giocatori i muri fermano il movimento.</w:t>
+              <w:t xml:space="preserve">I giocatori muovono qualunque token non bloccato; per i token il GM può escludere i muri tenendo premuto Alt, mentre per i giocatori i muri fermano il movimento. Quando un muro ferma un token che il GM sta trascinando, un avviso ricorda l'uso di Alt.</w:t>
             </w:r>
           </w:p>
         </w:tc>
@@ -3135,7 +3574,7 @@
                 <w:color w:val="555560"/>
                 <w:sz w:val="18"/>
               </w:rPr>
-              <w:t>Tutti</w:t>
+              <w:t xml:space="preserve">Tutti</w:t>
             </w:r>
           </w:p>
         </w:tc>
@@ -3159,7 +3598,7 @@
                 <w:i w:val="0"/>
                 <w:sz w:val="20"/>
               </w:rPr>
-              <w:t>Proprietari e visione</w:t>
+              <w:t xml:space="preserve">Proprietari e visione</w:t>
             </w:r>
           </w:p>
         </w:tc>
@@ -3178,7 +3617,7 @@
                 <w:i w:val="0"/>
                 <w:sz w:val="20"/>
               </w:rPr>
-              <w:t>Il GM assegna un token a un giocatore e ne imposta raggio di vista, scurovisione e luce portata (candela, torcia, lanterna…).</w:t>
+              <w:t xml:space="preserve">Il GM assegna un token a un giocatore e ne imposta raggio di vista, scurovisione e luce portata (candela, torcia, lanterna…).</w:t>
             </w:r>
           </w:p>
         </w:tc>
@@ -3199,7 +3638,7 @@
                 <w:color w:val="5B44B8"/>
                 <w:sz w:val="18"/>
               </w:rPr>
-              <w:t>Solo GM</w:t>
+              <w:t xml:space="preserve">Solo GM</w:t>
             </w:r>
           </w:p>
         </w:tc>
@@ -3222,7 +3661,7 @@
                 <w:i w:val="0"/>
                 <w:sz w:val="20"/>
               </w:rPr>
-              <w:t>Aggancio (cavalcature, veicoli)</w:t>
+              <w:t xml:space="preserve">Token in incognito</w:t>
             </w:r>
           </w:p>
         </w:tc>
@@ -3240,7 +3679,7 @@
                 <w:i w:val="0"/>
                 <w:sz w:val="20"/>
               </w:rPr>
-              <w:t>«Aggancia a…» lega un token a un altro: muovendo il principale l'agganciato lo segue, con le stesse collisioni. Muoverlo da solo lo sgancia; cancellare il principale libera gli agganciati.</w:t>
+              <w:t xml:space="preserve">Il GM mette un token in incognito: i giocatori vedono una sagoma scura con «?», e nome e aspetto veri non arrivano nemmeno nei loro dati. Il GM lo vede com'è, con un badge «?», e lo svela quando vuole.</w:t>
             </w:r>
           </w:p>
         </w:tc>
@@ -3255,12 +3694,12 @@
             </w:pPr>
             <w:r>
               <w:rPr>
-                <w:b w:val="0"/>
-                <w:i w:val="0"/>
-                <w:color w:val="555560"/>
+                <w:b/>
+                <w:i w:val="0"/>
+                <w:color w:val="5B44B8"/>
                 <w:sz w:val="18"/>
               </w:rPr>
-              <w:t>Tutti</w:t>
+              <w:t xml:space="preserve">Solo GM</w:t>
             </w:r>
           </w:p>
         </w:tc>
@@ -3284,7 +3723,7 @@
                 <w:i w:val="0"/>
                 <w:sz w:val="20"/>
               </w:rPr>
-              <w:t>Ordine dei turni</w:t>
+              <w:t xml:space="preserve">Quota</w:t>
             </w:r>
           </w:p>
         </w:tc>
@@ -3303,7 +3742,7 @@
                 <w:i w:val="0"/>
                 <w:sz w:val="20"/>
               </w:rPr>
-              <w:t>Pannello «Turni»: il GM aggiunge token, scrive i valori di iniziativa e preme «Avanti» (tasto N). Il token di turno ha un anello dorato; i giocatori vedono l'ordine e ritoccano i valori. I token nascosti restano nascosti.</w:t>
+              <w:t xml:space="preserve">Volo, balconate, fosse: la quota nell'unità del righello compare come pillola sopra il token («+15 ft») e il righello misura anche il dislivello.</w:t>
             </w:r>
           </w:p>
         </w:tc>
@@ -3324,7 +3763,257 @@
                 <w:color w:val="555560"/>
                 <w:sz w:val="18"/>
               </w:rPr>
-              <w:t>Tutti (GM gestisce)</w:t>
+              <w:t xml:space="preserve">Tutti</w:t>
+            </w:r>
+          </w:p>
+        </w:tc>
+      </w:tr>
+      <w:tr>
+        <w:trPr>
+          <w:cantSplit w:val="true"/>
+        </w:trPr>
+        <w:tc>
+          <w:tcPr>
+            <w:tcW w:type="dxa" w:w="2041"/>
+          </w:tcPr>
+          <w:p>
+            <w:pPr>
+              <w:spacing w:after="0"/>
+            </w:pPr>
+            <w:r>
+              <w:rPr>
+                <w:b/>
+                <w:i w:val="0"/>
+                <w:sz w:val="20"/>
+              </w:rPr>
+              <w:t xml:space="preserve">Aggancio (cavalcature, veicoli)</w:t>
+            </w:r>
+          </w:p>
+        </w:tc>
+        <w:tc>
+          <w:tcPr>
+            <w:tcW w:type="dxa" w:w="6576"/>
+          </w:tcPr>
+          <w:p>
+            <w:pPr>
+              <w:spacing w:after="0"/>
+            </w:pPr>
+            <w:r>
+              <w:rPr>
+                <w:b w:val="0"/>
+                <w:i w:val="0"/>
+                <w:sz w:val="20"/>
+              </w:rPr>
+              <w:t xml:space="preserve">«Aggancia a…» lega un token a un altro: muovendo il principale l'agganciato lo segue, con le stesse collisioni. Muoverlo da solo lo sgancia; cancellare il principale libera gli agganciati.</w:t>
+            </w:r>
+          </w:p>
+        </w:tc>
+        <w:tc>
+          <w:tcPr>
+            <w:tcW w:type="dxa" w:w="1020"/>
+          </w:tcPr>
+          <w:p>
+            <w:pPr>
+              <w:spacing w:after="0"/>
+              <w:jc w:val="center"/>
+            </w:pPr>
+            <w:r>
+              <w:rPr>
+                <w:b w:val="0"/>
+                <w:i w:val="0"/>
+                <w:color w:val="555560"/>
+                <w:sz w:val="18"/>
+              </w:rPr>
+              <w:t xml:space="preserve">Tutti</w:t>
+            </w:r>
+          </w:p>
+        </w:tc>
+      </w:tr>
+      <w:tr>
+        <w:trPr>
+          <w:cantSplit w:val="true"/>
+        </w:trPr>
+        <w:tc>
+          <w:tcPr>
+            <w:tcW w:type="dxa" w:w="2041"/>
+            <w:shd w:val="clear" w:color="auto" w:fill="F8F6FD"/>
+          </w:tcPr>
+          <w:p>
+            <w:pPr>
+              <w:spacing w:after="0"/>
+            </w:pPr>
+            <w:r>
+              <w:rPr>
+                <w:b/>
+                <w:i w:val="0"/>
+                <w:sz w:val="20"/>
+              </w:rPr>
+              <w:t xml:space="preserve">Ordine dei turni</w:t>
+            </w:r>
+          </w:p>
+        </w:tc>
+        <w:tc>
+          <w:tcPr>
+            <w:tcW w:type="dxa" w:w="6576"/>
+            <w:shd w:val="clear" w:color="auto" w:fill="F8F6FD"/>
+          </w:tcPr>
+          <w:p>
+            <w:pPr>
+              <w:spacing w:after="0"/>
+            </w:pPr>
+            <w:r>
+              <w:rPr>
+                <w:b w:val="0"/>
+                <w:i w:val="0"/>
+                <w:sz w:val="20"/>
+              </w:rPr>
+              <w:t xml:space="preserve">Pannello «Turni»: il GM aggiunge token, scrive i valori di iniziativa e preme «Avanti» (tasto N). Il token di turno ha un anello dorato; i giocatori vedono l'ordine e ritoccano i valori. I token nascosti restano nascosti. Accanto ai nomi si vedono PF (o la fascia) e condizioni.</w:t>
+            </w:r>
+          </w:p>
+        </w:tc>
+        <w:tc>
+          <w:tcPr>
+            <w:tcW w:type="dxa" w:w="1020"/>
+            <w:shd w:val="clear" w:color="auto" w:fill="F8F6FD"/>
+          </w:tcPr>
+          <w:p>
+            <w:pPr>
+              <w:spacing w:after="0"/>
+              <w:jc w:val="center"/>
+            </w:pPr>
+            <w:r>
+              <w:rPr>
+                <w:b w:val="0"/>
+                <w:i w:val="0"/>
+                <w:color w:val="555560"/>
+                <w:sz w:val="18"/>
+              </w:rPr>
+              <w:t xml:space="preserve">Tutti (GM gestisce)</w:t>
+            </w:r>
+          </w:p>
+        </w:tc>
+      </w:tr>
+      <w:tr>
+        <w:trPr>
+          <w:cantSplit w:val="true"/>
+        </w:trPr>
+        <w:tc>
+          <w:tcPr>
+            <w:tcW w:type="dxa" w:w="2041"/>
+          </w:tcPr>
+          <w:p>
+            <w:pPr>
+              <w:spacing w:after="0"/>
+            </w:pPr>
+            <w:r>
+              <w:rPr>
+                <w:b/>
+                <w:i w:val="0"/>
+                <w:sz w:val="20"/>
+              </w:rPr>
+              <w:t xml:space="preserve">Punti ferita</w:t>
+            </w:r>
+          </w:p>
+        </w:tc>
+        <w:tc>
+          <w:tcPr>
+            <w:tcW w:type="dxa" w:w="6576"/>
+          </w:tcPr>
+          <w:p>
+            <w:pPr>
+              <w:spacing w:after="0"/>
+            </w:pPr>
+            <w:r>
+              <w:rPr>
+                <w:b w:val="0"/>
+                <w:i w:val="0"/>
+                <w:sz w:val="20"/>
+              </w:rPr>
+              <w:t xml:space="preserve">Il GM dà a un token PF attuali, massimi e temporanei e sceglie chi li vede: tutti, i giocatori solo come fascia (illeso, ferito, malconcio, a terra) o solo il GM; i numeri segreti restano nel documento del GM. Una barra sotto il token li mostra e un token a terra ha una croce rossa. «Danno o cura» (D) accetta -7 o +5, anche su più token insieme, e consuma prima i temporanei. I giocatori cambiano solo i PF visibili a tutti.</w:t>
+            </w:r>
+          </w:p>
+        </w:tc>
+        <w:tc>
+          <w:tcPr>
+            <w:tcW w:type="dxa" w:w="1020"/>
+          </w:tcPr>
+          <w:p>
+            <w:pPr>
+              <w:spacing w:after="0"/>
+              <w:jc w:val="center"/>
+            </w:pPr>
+            <w:r>
+              <w:rPr>
+                <w:b w:val="0"/>
+                <w:i w:val="0"/>
+                <w:color w:val="555560"/>
+                <w:sz w:val="18"/>
+              </w:rPr>
+              <w:t xml:space="preserve">Tutti (GM gestisce)</w:t>
+            </w:r>
+          </w:p>
+        </w:tc>
+      </w:tr>
+      <w:tr>
+        <w:trPr>
+          <w:cantSplit w:val="true"/>
+        </w:trPr>
+        <w:tc>
+          <w:tcPr>
+            <w:tcW w:type="dxa" w:w="2041"/>
+            <w:shd w:val="clear" w:color="auto" w:fill="F8F6FD"/>
+          </w:tcPr>
+          <w:p>
+            <w:pPr>
+              <w:spacing w:after="0"/>
+            </w:pPr>
+            <w:r>
+              <w:rPr>
+                <w:b/>
+                <w:i w:val="0"/>
+                <w:sz w:val="20"/>
+              </w:rPr>
+              <w:t xml:space="preserve">Condizioni</w:t>
+            </w:r>
+          </w:p>
+        </w:tc>
+        <w:tc>
+          <w:tcPr>
+            <w:tcW w:type="dxa" w:w="6576"/>
+            <w:shd w:val="clear" w:color="auto" w:fill="F8F6FD"/>
+          </w:tcPr>
+          <w:p>
+            <w:pPr>
+              <w:spacing w:after="0"/>
+            </w:pPr>
+            <w:r>
+              <w:rPr>
+                <w:b w:val="0"/>
+                <w:i w:val="0"/>
+                <w:sz w:val="20"/>
+              </w:rPr>
+              <w:t xml:space="preserve">16 condizioni comuni (prono, avvelenato, stordito, concentrato…) come icone sul token, più fino a 8 personalizzate con etichetta e colore. Ognuna può durare un certo numero di round: il contatore scende all'inizio del turno del token e, quando finisce, il GM riceve un avviso. Le mettono e tolgono tutti, sui token che possono muovere.</w:t>
+            </w:r>
+          </w:p>
+        </w:tc>
+        <w:tc>
+          <w:tcPr>
+            <w:tcW w:type="dxa" w:w="1020"/>
+            <w:shd w:val="clear" w:color="auto" w:fill="F8F6FD"/>
+          </w:tcPr>
+          <w:p>
+            <w:pPr>
+              <w:spacing w:after="0"/>
+              <w:jc w:val="center"/>
+            </w:pPr>
+            <w:r>
+              <w:rPr>
+                <w:b w:val="0"/>
+                <w:i w:val="0"/>
+                <w:color w:val="555560"/>
+                <w:sz w:val="18"/>
+              </w:rPr>
+              <w:t xml:space="preserve">Tutti</w:t>
             </w:r>
           </w:p>
         </w:tc>
@@ -3457,7 +4146,7 @@
                 <w:i w:val="0"/>
                 <w:sz w:val="20"/>
               </w:rPr>
-              <w:t>Mappe da immagine</w:t>
+              <w:t xml:space="preserve">Mappe da immagine</w:t>
             </w:r>
           </w:p>
         </w:tc>
@@ -3475,7 +4164,7 @@
                 <w:i w:val="0"/>
                 <w:sz w:val="20"/>
               </w:rPr>
-              <w:t>Immagini sul livello mappa, ridimensionabili e ruotabili, che i giocatori non possono modificare.</w:t>
+              <w:t xml:space="preserve">Immagini sul livello mappa, ridimensionabili e ruotabili, che i giocatori non possono modificare.</w:t>
             </w:r>
           </w:p>
         </w:tc>
@@ -3495,7 +4184,7 @@
                 <w:color w:val="5B44B8"/>
                 <w:sz w:val="18"/>
               </w:rPr>
-              <w:t>Solo GM</w:t>
+              <w:t xml:space="preserve">Solo GM</w:t>
             </w:r>
           </w:p>
         </w:tc>
@@ -3519,7 +4208,7 @@
                 <w:i w:val="0"/>
                 <w:sz w:val="20"/>
               </w:rPr>
-              <w:t>Mappe animate</w:t>
+              <w:t xml:space="preserve">Mappe animate</w:t>
             </w:r>
           </w:p>
         </w:tc>
@@ -3538,7 +4227,7 @@
                 <w:i w:val="0"/>
                 <w:sz w:val="20"/>
               </w:rPr>
-              <w:t>Video WebM o MP4 (fino a 50 MB) usati come mappa: si ripetono in loop, senza audio, e girano per tutti i giocatori.</w:t>
+              <w:t xml:space="preserve">Video WebM o MP4 (fino a 50 MB) usati come mappa: si ripetono in loop, senza audio, e girano per tutti i giocatori.</w:t>
             </w:r>
           </w:p>
         </w:tc>
@@ -3559,7 +4248,7 @@
                 <w:color w:val="5B44B8"/>
                 <w:sz w:val="18"/>
               </w:rPr>
-              <w:t>Solo GM</w:t>
+              <w:t xml:space="preserve">Solo GM</w:t>
             </w:r>
           </w:p>
         </w:tc>
@@ -3582,7 +4271,7 @@
                 <w:i w:val="0"/>
                 <w:sz w:val="20"/>
               </w:rPr>
-              <w:t>Biomi dipingibili</w:t>
+              <w:t xml:space="preserve">Mappe Universal VTT</w:t>
             </w:r>
           </w:p>
         </w:tc>
@@ -3600,7 +4289,7 @@
                 <w:i w:val="0"/>
                 <w:sz w:val="20"/>
               </w:rPr>
-              <w:t>13 biomi (erba, prato secco, foresta, roccia, ghiaia, sabbia, neve, ghiaccio, fango, palude, acqua bassa e profonda, lava) a pennello o come regioni dai bordi morbidi; texture generate nel browser e visibili agli altri a ogni pennellata.</w:t>
+              <w:t xml:space="preserve">Un file .uvtt, .dd2vtt o .df2vtt (trascinato, incollato o caricato) porta sulla lavagna immagine, muri, porte e luci in un solo passo di annulla; la mappa si adatta alla griglia della scena e muri e porte restano agganciati all'immagine.</w:t>
             </w:r>
           </w:p>
         </w:tc>
@@ -3620,7 +4309,7 @@
                 <w:color w:val="5B44B8"/>
                 <w:sz w:val="18"/>
               </w:rPr>
-              <w:t>Solo GM</w:t>
+              <w:t xml:space="preserve">Solo GM</w:t>
             </w:r>
           </w:p>
         </w:tc>
@@ -3644,7 +4333,7 @@
                 <w:i w:val="0"/>
                 <w:sz w:val="20"/>
               </w:rPr>
-              <w:t>Riempimento e gomma</w:t>
+              <w:t xml:space="preserve">Biomi dipingibili</w:t>
             </w:r>
           </w:p>
         </w:tc>
@@ -3663,7 +4352,7 @@
                 <w:i w:val="0"/>
                 <w:sz w:val="20"/>
               </w:rPr>
-              <w:t>Riempie le aree chiuse da muri o altri biomi; gomma del terreno.</w:t>
+              <w:t xml:space="preserve">14 biomi (erba, prato secco, foresta, roccia, ghiaia, sabbia, neve, ghiaccio, fango, palude, acqua bassa e profonda, lava, legno) a pennello o come regioni dai bordi morbidi o esatti; texture generate nel browser e visibili agli altri a ogni pennellata.</w:t>
             </w:r>
           </w:p>
         </w:tc>
@@ -3684,7 +4373,7 @@
                 <w:color w:val="5B44B8"/>
                 <w:sz w:val="18"/>
               </w:rPr>
-              <w:t>Solo GM</w:t>
+              <w:t xml:space="preserve">Solo GM</w:t>
             </w:r>
           </w:p>
         </w:tc>
@@ -3707,7 +4396,7 @@
                 <w:i w:val="0"/>
                 <w:sz w:val="20"/>
               </w:rPr>
-              <w:t>Copia e incolla del terreno</w:t>
+              <w:t xml:space="preserve">Riempimento e gomma</w:t>
             </w:r>
           </w:p>
         </w:tc>
@@ -3725,7 +4414,7 @@
                 <w:i w:val="0"/>
                 <w:sz w:val="20"/>
               </w:rPr>
-              <w:t>Si copia una porzione di terreno e la si incolla altrove con il bordo netto.</w:t>
+              <w:t xml:space="preserve">Riempie le aree chiuse da muri o altri biomi; gomma del terreno.</w:t>
             </w:r>
           </w:p>
         </w:tc>
@@ -3745,7 +4434,7 @@
                 <w:color w:val="5B44B8"/>
                 <w:sz w:val="18"/>
               </w:rPr>
-              <w:t>Solo GM</w:t>
+              <w:t xml:space="preserve">Solo GM</w:t>
             </w:r>
           </w:p>
         </w:tc>
@@ -3769,7 +4458,7 @@
                 <w:i w:val="0"/>
                 <w:sz w:val="20"/>
               </w:rPr>
-              <w:t>Pittura sotto la nebbia</w:t>
+              <w:t xml:space="preserve">Copia e incolla del terreno</w:t>
             </w:r>
           </w:p>
         </w:tc>
@@ -3788,7 +4477,7 @@
                 <w:i w:val="0"/>
                 <w:sz w:val="20"/>
               </w:rPr>
-              <w:t>Ogni pennellata nasce coperta dalla nebbia, da rivelare al momento giusto.</w:t>
+              <w:t xml:space="preserve">Si copia una porzione di terreno e la si incolla altrove con il bordo netto.</w:t>
             </w:r>
           </w:p>
         </w:tc>
@@ -3809,7 +4498,7 @@
                 <w:color w:val="5B44B8"/>
                 <w:sz w:val="18"/>
               </w:rPr>
-              <w:t>Solo GM</w:t>
+              <w:t xml:space="preserve">Solo GM</w:t>
             </w:r>
           </w:p>
         </w:tc>
@@ -3832,7 +4521,7 @@
                 <w:i w:val="0"/>
                 <w:sz w:val="20"/>
               </w:rPr>
-              <w:t>Strade e fiumi</w:t>
+              <w:t xml:space="preserve">Pittura sotto la nebbia</w:t>
             </w:r>
           </w:p>
         </w:tc>
@@ -3850,7 +4539,7 @@
                 <w:i w:val="0"/>
                 <w:sz w:val="20"/>
               </w:rPr>
-              <w:t>Cinque stili (sentiero, strada sterrata, strada lastricata, ruscello, fiume): la curva passa per i punti, ogni punto ha la sua larghezza e i corsi d'acqua si assottigliano alle estremità.</w:t>
+              <w:t xml:space="preserve">Ogni pennellata nasce coperta dalla nebbia, da rivelare al momento giusto.</w:t>
             </w:r>
           </w:p>
         </w:tc>
@@ -3870,7 +4559,7 @@
                 <w:color w:val="5B44B8"/>
                 <w:sz w:val="18"/>
               </w:rPr>
-              <w:t>Solo GM</w:t>
+              <w:t xml:space="preserve">Solo GM</w:t>
             </w:r>
           </w:p>
         </w:tc>
@@ -3894,7 +4583,7 @@
                 <w:i w:val="0"/>
                 <w:sz w:val="20"/>
               </w:rPr>
-              <w:t>Timbri</w:t>
+              <w:t xml:space="preserve">Strade e fiumi</w:t>
             </w:r>
           </w:p>
         </w:tc>
@@ -3913,7 +4602,7 @@
                 <w:i w:val="0"/>
                 <w:sz w:val="20"/>
               </w:rPr>
-              <w:t>Dieci elementi di scenario (albero, pino, cespuglio, roccia, masso, barile, cassa, tavolo, sedia, letto), con rotazione, taglia e variante casuali; trascinando se ne spargono molti.</w:t>
+              <w:t xml:space="preserve">Cinque stili (sentiero, strada sterrata, strada lastricata, ruscello, fiume): la curva passa per i punti, ogni punto ha la sua larghezza e i corsi d'acqua si assottigliano alle estremità.</w:t>
             </w:r>
           </w:p>
         </w:tc>
@@ -3934,7 +4623,7 @@
                 <w:color w:val="5B44B8"/>
                 <w:sz w:val="18"/>
               </w:rPr>
-              <w:t>Solo GM</w:t>
+              <w:t xml:space="preserve">Solo GM</w:t>
             </w:r>
           </w:p>
         </w:tc>
@@ -3957,7 +4646,7 @@
                 <w:i w:val="0"/>
                 <w:sz w:val="20"/>
               </w:rPr>
-              <w:t>Tavolozza rapida</w:t>
+              <w:t xml:space="preserve">Timbri</w:t>
             </w:r>
           </w:p>
         </w:tc>
@@ -3975,7 +4664,7 @@
                 <w:i w:val="0"/>
                 <w:sz w:val="20"/>
               </w:rPr>
-              <w:t>I tasti 1–9 scelgono i biomi recenti, gli stili di percorso o i timbri.</w:t>
+              <w:t xml:space="preserve">Dieci elementi di scenario (albero, pino, cespuglio, roccia, masso, barile, cassa, tavolo, sedia, letto), con rotazione, taglia e variante casuali; trascinando se ne spargono molti.</w:t>
             </w:r>
           </w:p>
         </w:tc>
@@ -3995,7 +4684,132 @@
                 <w:color w:val="5B44B8"/>
                 <w:sz w:val="18"/>
               </w:rPr>
-              <w:t>Solo GM</w:t>
+              <w:t xml:space="preserve">Solo GM</w:t>
+            </w:r>
+          </w:p>
+        </w:tc>
+      </w:tr>
+      <w:tr>
+        <w:trPr>
+          <w:cantSplit w:val="true"/>
+        </w:trPr>
+        <w:tc>
+          <w:tcPr>
+            <w:tcW w:type="dxa" w:w="2041"/>
+            <w:shd w:val="clear" w:color="auto" w:fill="F8F6FD"/>
+          </w:tcPr>
+          <w:p>
+            <w:pPr>
+              <w:spacing w:after="0"/>
+            </w:pPr>
+            <w:r>
+              <w:rPr>
+                <w:b/>
+                <w:i w:val="0"/>
+                <w:sz w:val="20"/>
+              </w:rPr>
+              <w:t xml:space="preserve">Tetti</w:t>
+            </w:r>
+          </w:p>
+        </w:tc>
+        <w:tc>
+          <w:tcPr>
+            <w:tcW w:type="dxa" w:w="6576"/>
+            <w:shd w:val="clear" w:color="auto" w:fill="F8F6FD"/>
+          </w:tcPr>
+          <w:p>
+            <w:pPr>
+              <w:spacing w:after="0"/>
+            </w:pPr>
+            <w:r>
+              <w:rPr>
+                <w:b w:val="0"/>
+                <w:i w:val="0"/>
+                <w:sz w:val="20"/>
+              </w:rPr>
+              <w:t xml:space="preserve">Poligoni procedurali a tegole, paglia o ardesia (strumento Tetti, U) oppure un'immagine della mappa segnata come «Tetto»: stanno sopra i token e diventano quasi trasparenti quando un token visibile ci entra, svelando l'interno.</w:t>
+            </w:r>
+          </w:p>
+        </w:tc>
+        <w:tc>
+          <w:tcPr>
+            <w:tcW w:type="dxa" w:w="1020"/>
+            <w:shd w:val="clear" w:color="auto" w:fill="F8F6FD"/>
+          </w:tcPr>
+          <w:p>
+            <w:pPr>
+              <w:spacing w:after="0"/>
+              <w:jc w:val="center"/>
+            </w:pPr>
+            <w:r>
+              <w:rPr>
+                <w:b/>
+                <w:i w:val="0"/>
+                <w:color w:val="5B44B8"/>
+                <w:sz w:val="18"/>
+              </w:rPr>
+              <w:t xml:space="preserve">Solo GM</w:t>
+            </w:r>
+          </w:p>
+        </w:tc>
+      </w:tr>
+      <w:tr>
+        <w:trPr>
+          <w:cantSplit w:val="true"/>
+        </w:trPr>
+        <w:tc>
+          <w:tcPr>
+            <w:tcW w:type="dxa" w:w="2041"/>
+          </w:tcPr>
+          <w:p>
+            <w:pPr>
+              <w:spacing w:after="0"/>
+            </w:pPr>
+            <w:r>
+              <w:rPr>
+                <w:b/>
+                <w:i w:val="0"/>
+                <w:sz w:val="20"/>
+              </w:rPr>
+              <w:t xml:space="preserve">Tavolozza rapida</w:t>
+            </w:r>
+          </w:p>
+        </w:tc>
+        <w:tc>
+          <w:tcPr>
+            <w:tcW w:type="dxa" w:w="6576"/>
+          </w:tcPr>
+          <w:p>
+            <w:pPr>
+              <w:spacing w:after="0"/>
+            </w:pPr>
+            <w:r>
+              <w:rPr>
+                <w:b w:val="0"/>
+                <w:i w:val="0"/>
+                <w:sz w:val="20"/>
+              </w:rPr>
+              <w:t xml:space="preserve">I tasti 1–9 scelgono i biomi recenti, gli stili di percorso o i timbri.</w:t>
+            </w:r>
+          </w:p>
+        </w:tc>
+        <w:tc>
+          <w:tcPr>
+            <w:tcW w:type="dxa" w:w="1020"/>
+          </w:tcPr>
+          <w:p>
+            <w:pPr>
+              <w:spacing w:after="0"/>
+              <w:jc w:val="center"/>
+            </w:pPr>
+            <w:r>
+              <w:rPr>
+                <w:b/>
+                <w:i w:val="0"/>
+                <w:color w:val="5B44B8"/>
+                <w:sz w:val="18"/>
+              </w:rPr>
+              <w:t xml:space="preserve">Solo GM</w:t>
             </w:r>
           </w:p>
         </w:tc>
@@ -4128,7 +4942,7 @@
                 <w:i w:val="0"/>
                 <w:sz w:val="20"/>
               </w:rPr>
-              <w:t>Muri</w:t>
+              <w:t xml:space="preserve">Muri</w:t>
             </w:r>
           </w:p>
         </w:tc>
@@ -4146,7 +4960,7 @@
                 <w:i w:val="0"/>
                 <w:sz w:val="20"/>
               </w:rPr>
-              <w:t>Polilinee agganciate agli incroci della griglia (Alt le lascia libere), modificabili trascinando i vertici. Fermano i token trascinati; si possono generare dal contorno di un bioma.</w:t>
+              <w:t xml:space="preserve">Polilinee agganciate agli incroci della griglia (Alt le lascia libere), modificabili trascinando i vertici. Fermano i token trascinati; si possono generare dal contorno di un bioma. Quelli importati o tracciati con Gemini restano agganciati alla loro immagine e la seguono se la si sposta.</w:t>
             </w:r>
           </w:p>
         </w:tc>
@@ -4166,7 +4980,7 @@
                 <w:color w:val="5B44B8"/>
                 <w:sz w:val="18"/>
               </w:rPr>
-              <w:t>Solo GM</w:t>
+              <w:t xml:space="preserve">Solo GM</w:t>
             </w:r>
           </w:p>
         </w:tc>
@@ -4190,7 +5004,7 @@
                 <w:i w:val="0"/>
                 <w:sz w:val="20"/>
               </w:rPr>
-              <w:t>Porte</w:t>
+              <w:t xml:space="preserve">Porte</w:t>
             </w:r>
           </w:p>
         </w:tc>
@@ -4209,7 +5023,7 @@
                 <w:i w:val="0"/>
                 <w:sz w:val="20"/>
               </w:rPr>
-              <w:t>Stati aperta, chiusa e chiusa a chiave, con icona cliccabile. I giocatori le aprono e chiudono solo se non sono a chiave e non coperte dalla nebbia o dal buio.</w:t>
+              <w:t xml:space="preserve">Stati aperta, chiusa e chiusa a chiave, con icona cliccabile. I giocatori le aprono e chiudono solo se non sono a chiave e non coperte dalla nebbia o dal buio. Una porta aperta apre un varco anche nel muro su cui è disegnata.</w:t>
             </w:r>
           </w:p>
         </w:tc>
@@ -4230,7 +5044,7 @@
                 <w:color w:val="555560"/>
                 <w:sz w:val="18"/>
               </w:rPr>
-              <w:t>Tutti</w:t>
+              <w:t xml:space="preserve">Tutti</w:t>
             </w:r>
           </w:p>
         </w:tc>
@@ -4253,7 +5067,7 @@
                 <w:i w:val="0"/>
                 <w:sz w:val="20"/>
               </w:rPr>
-              <w:t>Finestre e muri invisibili</w:t>
+              <w:t xml:space="preserve">Porte segrete</w:t>
             </w:r>
           </w:p>
         </w:tc>
@@ -4271,7 +5085,7 @@
                 <w:i w:val="0"/>
                 <w:sz w:val="20"/>
               </w:rPr>
-              <w:t>Le finestre bloccano il movimento ma non la vista; i muri invisibili fermano solo i token.</w:t>
+              <w:t xml:space="preserve">Per i giocatori una porta segreta è un muro qualsiasi: nessuna icona e non si apre. Il GM la vede tratteggiata e la rivela dal pannello del muro.</w:t>
             </w:r>
           </w:p>
         </w:tc>
@@ -4291,7 +5105,7 @@
                 <w:color w:val="5B44B8"/>
                 <w:sz w:val="18"/>
               </w:rPr>
-              <w:t>Solo GM</w:t>
+              <w:t xml:space="preserve">Solo GM</w:t>
             </w:r>
           </w:p>
         </w:tc>
@@ -4315,7 +5129,7 @@
                 <w:i w:val="0"/>
                 <w:sz w:val="20"/>
               </w:rPr>
-              <w:t>Muri a senso unico</w:t>
+              <w:t xml:space="preserve">Finestre e muri invisibili</w:t>
             </w:r>
           </w:p>
         </w:tc>
@@ -4334,7 +5148,7 @@
                 <w:i w:val="0"/>
                 <w:sz w:val="20"/>
               </w:rPr>
-              <w:t>Per dirupi e sporgenze: si vede attraverso solo da un lato. Frecce indicano il verso e «Inverti il verso» scambia i lati.</w:t>
+              <w:t xml:space="preserve">Le finestre bloccano il movimento ma non la vista; i muri invisibili fermano solo i token.</w:t>
             </w:r>
           </w:p>
         </w:tc>
@@ -4355,7 +5169,7 @@
                 <w:color w:val="5B44B8"/>
                 <w:sz w:val="18"/>
               </w:rPr>
-              <w:t>Solo GM</w:t>
+              <w:t xml:space="preserve">Solo GM</w:t>
             </w:r>
           </w:p>
         </w:tc>
@@ -4378,7 +5192,7 @@
                 <w:i w:val="0"/>
                 <w:sz w:val="20"/>
               </w:rPr>
-              <w:t>Muri di terreno</w:t>
+              <w:t xml:space="preserve">Muri a senso unico</w:t>
             </w:r>
           </w:p>
         </w:tc>
@@ -4396,7 +5210,7 @@
                 <w:i w:val="0"/>
                 <w:sz w:val="20"/>
               </w:rPr>
-              <w:t>Per colonne e rocce: si vede la faccia davanti ma non il retro, perché il secondo muro lungo la linea di vista ferma lo sguardo.</w:t>
+              <w:t xml:space="preserve">Per dirupi e sporgenze: si vede attraverso solo da un lato. Frecce indicano il verso e «Inverti il verso» scambia i lati.</w:t>
             </w:r>
           </w:p>
         </w:tc>
@@ -4416,7 +5230,7 @@
                 <w:color w:val="5B44B8"/>
                 <w:sz w:val="18"/>
               </w:rPr>
-              <w:t>Solo GM</w:t>
+              <w:t xml:space="preserve">Solo GM</w:t>
             </w:r>
           </w:p>
         </w:tc>
@@ -4440,7 +5254,7 @@
                 <w:i w:val="0"/>
                 <w:sz w:val="20"/>
               </w:rPr>
-              <w:t>Luci</w:t>
+              <w:t xml:space="preserve">Muri di terreno</w:t>
             </w:r>
           </w:p>
         </w:tc>
@@ -4459,7 +5273,7 @@
                 <w:i w:val="0"/>
                 <w:sz w:val="20"/>
               </w:rPr>
-              <w:t>Sorgenti fisse con raggio di luce piena e fioca (candela, torcia, lanterna, falò, luce magica) e luci portate dai token.</w:t>
+              <w:t xml:space="preserve">Per colonne e rocce: si vede la faccia davanti ma non il retro, perché il secondo muro lungo la linea di vista ferma lo sguardo.</w:t>
             </w:r>
           </w:p>
         </w:tc>
@@ -4480,7 +5294,7 @@
                 <w:color w:val="5B44B8"/>
                 <w:sz w:val="18"/>
               </w:rPr>
-              <w:t>Solo GM</w:t>
+              <w:t xml:space="preserve">Solo GM</w:t>
             </w:r>
           </w:p>
         </w:tc>
@@ -4503,7 +5317,7 @@
                 <w:i w:val="0"/>
                 <w:sz w:val="20"/>
               </w:rPr>
-              <w:t>Visione dinamica</w:t>
+              <w:t xml:space="preserve">Luci</w:t>
             </w:r>
           </w:p>
         </w:tc>
@@ -4521,7 +5335,7 @@
                 <w:i w:val="0"/>
                 <w:sz w:val="20"/>
               </w:rPr>
-              <w:t>Ogni giocatore vede solo ciò che vedono i suoi token: muri e porte chiuse fermano la vista; di notte servono luci o scurovisione. Le zone già viste restano in penombra.</w:t>
+              <w:t xml:space="preserve">Sorgenti fisse con raggio di luce piena e fioca (candela, torcia, lanterna, falò, luce magica) e luci portate dai token.</w:t>
             </w:r>
           </w:p>
         </w:tc>
@@ -4541,7 +5355,7 @@
                 <w:color w:val="5B44B8"/>
                 <w:sz w:val="18"/>
               </w:rPr>
-              <w:t>Solo GM</w:t>
+              <w:t xml:space="preserve">Solo GM</w:t>
             </w:r>
           </w:p>
         </w:tc>
@@ -4565,7 +5379,7 @@
                 <w:i w:val="0"/>
                 <w:sz w:val="20"/>
               </w:rPr>
-              <w:t>Luce ambientale</w:t>
+              <w:t xml:space="preserve">Visione dinamica</w:t>
             </w:r>
           </w:p>
         </w:tc>
@@ -4584,7 +5398,7 @@
                 <w:i w:val="0"/>
                 <w:sz w:val="20"/>
               </w:rPr>
-              <w:t>Giorno, crepuscolo o notte: lo sfondo e le immagini si fanno più scuri e freddi.</w:t>
+              <w:t xml:space="preserve">Ogni giocatore vede solo ciò che vedono i suoi token: muri e porte chiuse fermano la vista; di notte servono luci o scurovisione. Le zone già viste restano in penombra.</w:t>
             </w:r>
           </w:p>
         </w:tc>
@@ -4605,7 +5419,7 @@
                 <w:color w:val="5B44B8"/>
                 <w:sz w:val="18"/>
               </w:rPr>
-              <w:t>Solo GM</w:t>
+              <w:t xml:space="preserve">Solo GM</w:t>
             </w:r>
           </w:p>
         </w:tc>
@@ -4628,7 +5442,7 @@
                 <w:i w:val="0"/>
                 <w:sz w:val="20"/>
               </w:rPr>
-              <w:t>Anteprima come un giocatore</w:t>
+              <w:t xml:space="preserve">Luce ambientale</w:t>
             </w:r>
           </w:p>
         </w:tc>
@@ -4646,7 +5460,7 @@
                 <w:i w:val="0"/>
                 <w:sz w:val="20"/>
               </w:rPr>
-              <w:t>Il GM può guardare la lavagna con gli occhi di uno specifico giocatore.</w:t>
+              <w:t xml:space="preserve">Giorno, crepuscolo o notte: lo sfondo e le immagini si fanno più scuri e freddi.</w:t>
             </w:r>
           </w:p>
         </w:tc>
@@ -4666,7 +5480,132 @@
                 <w:color w:val="5B44B8"/>
                 <w:sz w:val="18"/>
               </w:rPr>
-              <w:t>Solo GM</w:t>
+              <w:t xml:space="preserve">Solo GM</w:t>
+            </w:r>
+          </w:p>
+        </w:tc>
+      </w:tr>
+      <w:tr>
+        <w:trPr>
+          <w:cantSplit w:val="true"/>
+        </w:trPr>
+        <w:tc>
+          <w:tcPr>
+            <w:tcW w:type="dxa" w:w="2041"/>
+            <w:shd w:val="clear" w:color="auto" w:fill="F8F6FD"/>
+          </w:tcPr>
+          <w:p>
+            <w:pPr>
+              <w:spacing w:after="0"/>
+            </w:pPr>
+            <w:r>
+              <w:rPr>
+                <w:b/>
+                <w:i w:val="0"/>
+                <w:sz w:val="20"/>
+              </w:rPr>
+              <w:t xml:space="preserve">Meteo animato</w:t>
+            </w:r>
+          </w:p>
+        </w:tc>
+        <w:tc>
+          <w:tcPr>
+            <w:tcW w:type="dxa" w:w="6576"/>
+            <w:shd w:val="clear" w:color="auto" w:fill="F8F6FD"/>
+          </w:tcPr>
+          <w:p>
+            <w:pPr>
+              <w:spacing w:after="0"/>
+            </w:pPr>
+            <w:r>
+              <w:rPr>
+                <w:b w:val="0"/>
+                <w:i w:val="0"/>
+                <w:sz w:val="20"/>
+              </w:rPr>
+              <w:t xml:space="preserve">Pioggia, neve, braci o foschia per scena, come particelle animate sopra la lavagna (un solo fotogramma fermo con «riduci movimento» attivo nel sistema). Ognuno può spegnerlo solo per sé dalla barra in basso a destra.</w:t>
+            </w:r>
+          </w:p>
+        </w:tc>
+        <w:tc>
+          <w:tcPr>
+            <w:tcW w:type="dxa" w:w="1020"/>
+            <w:shd w:val="clear" w:color="auto" w:fill="F8F6FD"/>
+          </w:tcPr>
+          <w:p>
+            <w:pPr>
+              <w:spacing w:after="0"/>
+              <w:jc w:val="center"/>
+            </w:pPr>
+            <w:r>
+              <w:rPr>
+                <w:b/>
+                <w:i w:val="0"/>
+                <w:color w:val="5B44B8"/>
+                <w:sz w:val="18"/>
+              </w:rPr>
+              <w:t xml:space="preserve">Solo GM</w:t>
+            </w:r>
+          </w:p>
+        </w:tc>
+      </w:tr>
+      <w:tr>
+        <w:trPr>
+          <w:cantSplit w:val="true"/>
+        </w:trPr>
+        <w:tc>
+          <w:tcPr>
+            <w:tcW w:type="dxa" w:w="2041"/>
+          </w:tcPr>
+          <w:p>
+            <w:pPr>
+              <w:spacing w:after="0"/>
+            </w:pPr>
+            <w:r>
+              <w:rPr>
+                <w:b/>
+                <w:i w:val="0"/>
+                <w:sz w:val="20"/>
+              </w:rPr>
+              <w:t xml:space="preserve">Anteprima della vista</w:t>
+            </w:r>
+          </w:p>
+        </w:tc>
+        <w:tc>
+          <w:tcPr>
+            <w:tcW w:type="dxa" w:w="6576"/>
+          </w:tcPr>
+          <w:p>
+            <w:pPr>
+              <w:spacing w:after="0"/>
+            </w:pPr>
+            <w:r>
+              <w:rPr>
+                <w:b w:val="0"/>
+                <w:i w:val="0"/>
+                <w:sz w:val="20"/>
+              </w:rPr>
+              <w:t xml:space="preserve">Il GM può guardare la lavagna con gli occhi di un giocatore, di tutto il gruppo (come lo schermo al tavolo) o di un singolo token, anche un mostro senza giocatore («Guarda da qui»); un avviso ricorda da chi sta guardando.</w:t>
+            </w:r>
+          </w:p>
+        </w:tc>
+        <w:tc>
+          <w:tcPr>
+            <w:tcW w:type="dxa" w:w="1020"/>
+          </w:tcPr>
+          <w:p>
+            <w:pPr>
+              <w:spacing w:after="0"/>
+              <w:jc w:val="center"/>
+            </w:pPr>
+            <w:r>
+              <w:rPr>
+                <w:b/>
+                <w:i w:val="0"/>
+                <w:color w:val="5B44B8"/>
+                <w:sz w:val="18"/>
+              </w:rPr>
+              <w:t xml:space="preserve">Solo GM</w:t>
             </w:r>
           </w:p>
         </w:tc>
@@ -4799,7 +5738,7 @@
                 <w:i w:val="0"/>
                 <w:sz w:val="20"/>
               </w:rPr>
-              <w:t>Oggetti nascosti</w:t>
+              <w:t xml:space="preserve">Oggetti nascosti</w:t>
             </w:r>
           </w:p>
         </w:tc>
@@ -4817,7 +5756,7 @@
                 <w:i w:val="0"/>
                 <w:sz w:val="20"/>
               </w:rPr>
-              <w:t>Qualsiasi oggetto può essere nascosto ai giocatori (Maiusc+H) o creato già nascosto; il GM lo vede semitrasparente. Le immagini degli oggetti nascosti non si possono scaricare nemmeno conoscendone l'indirizzo.</w:t>
+              <w:t xml:space="preserve">Qualsiasi oggetto può essere nascosto ai giocatori (Maiusc+H) o creato già nascosto; il GM lo vede semitrasparente. Le immagini degli oggetti nascosti non si possono scaricare nemmeno conoscendone l'indirizzo.</w:t>
             </w:r>
           </w:p>
         </w:tc>
@@ -4837,7 +5776,7 @@
                 <w:color w:val="5B44B8"/>
                 <w:sz w:val="18"/>
               </w:rPr>
-              <w:t>Solo GM</w:t>
+              <w:t xml:space="preserve">Solo GM</w:t>
             </w:r>
           </w:p>
         </w:tc>
@@ -4861,7 +5800,7 @@
                 <w:i w:val="0"/>
                 <w:sz w:val="20"/>
               </w:rPr>
-              <w:t>Nebbia di guerra</w:t>
+              <w:t xml:space="preserve">Nebbia di guerra</w:t>
             </w:r>
           </w:p>
         </w:tc>
@@ -4880,7 +5819,7 @@
                 <w:i w:val="0"/>
                 <w:sz w:val="20"/>
               </w:rPr>
-              <w:t>Il GM copre o scopre aree con rettangolo, poligono o pennello, o copre tutta la mappa; la vede semitrasparente, mentre per i giocatori è opaca.</w:t>
+              <w:t xml:space="preserve">Il GM copre o scopre aree con rettangolo, poligono o pennello, o copre tutta la mappa; la vede semitrasparente, mentre per i giocatori è opaca.</w:t>
             </w:r>
           </w:p>
         </w:tc>
@@ -4901,7 +5840,7 @@
                 <w:color w:val="5B44B8"/>
                 <w:sz w:val="18"/>
               </w:rPr>
-              <w:t>Solo GM</w:t>
+              <w:t xml:space="preserve">Solo GM</w:t>
             </w:r>
           </w:p>
         </w:tc>
@@ -4924,7 +5863,7 @@
                 <w:i w:val="0"/>
                 <w:sz w:val="20"/>
               </w:rPr>
-              <w:t>Garantita dal server</w:t>
+              <w:t xml:space="preserve">Mostra ai giocatori</w:t>
             </w:r>
           </w:p>
         </w:tc>
@@ -4942,7 +5881,132 @@
                 <w:i w:val="0"/>
                 <w:sz w:val="20"/>
               </w:rPr>
-              <w:t>Gli oggetti nascosti stanno in un documento separato a cui il server permette l'accesso solo al GM; le modifiche non autorizzate dei giocatori vengono annullate dal server.</w:t>
+              <w:t xml:space="preserve">Il GM mostra un'immagine (dalla lavagna o dalla scheda «Caricati») a tutto schermo a tutti i giocatori, che possono chiuderla per sé; un avviso gli permette di smettere di mostrarla.</w:t>
+            </w:r>
+          </w:p>
+        </w:tc>
+        <w:tc>
+          <w:tcPr>
+            <w:tcW w:type="dxa" w:w="1020"/>
+          </w:tcPr>
+          <w:p>
+            <w:pPr>
+              <w:spacing w:after="0"/>
+              <w:jc w:val="center"/>
+            </w:pPr>
+            <w:r>
+              <w:rPr>
+                <w:b/>
+                <w:i w:val="0"/>
+                <w:color w:val="5B44B8"/>
+                <w:sz w:val="18"/>
+              </w:rPr>
+              <w:t xml:space="preserve">Solo GM</w:t>
+            </w:r>
+          </w:p>
+        </w:tc>
+      </w:tr>
+      <w:tr>
+        <w:trPr>
+          <w:cantSplit w:val="true"/>
+        </w:trPr>
+        <w:tc>
+          <w:tcPr>
+            <w:tcW w:type="dxa" w:w="2041"/>
+            <w:shd w:val="clear" w:color="auto" w:fill="F8F6FD"/>
+          </w:tcPr>
+          <w:p>
+            <w:pPr>
+              <w:spacing w:after="0"/>
+            </w:pPr>
+            <w:r>
+              <w:rPr>
+                <w:b/>
+                <w:i w:val="0"/>
+                <w:sz w:val="20"/>
+              </w:rPr>
+              <w:t xml:space="preserve">Note del GM</w:t>
+            </w:r>
+          </w:p>
+        </w:tc>
+        <w:tc>
+          <w:tcPr>
+            <w:tcW w:type="dxa" w:w="6576"/>
+            <w:shd w:val="clear" w:color="auto" w:fill="F8F6FD"/>
+          </w:tcPr>
+          <w:p>
+            <w:pPr>
+              <w:spacing w:after="0"/>
+            </w:pPr>
+            <w:r>
+              <w:rPr>
+                <w:b w:val="0"/>
+                <w:i w:val="0"/>
+                <w:sz w:val="20"/>
+              </w:rPr>
+              <w:t xml:space="preserve">Strumento Note (A): pin con icona (nota, trappola, tesoro, segreto, PNG), titolo e testo in Markdown. Nascono nascoste; rivelate, i giocatori le aprono con un clic in sola lettura. Il GM può anche mandarle in privato a un giocatore o a tutti quelli connessi.</w:t>
+            </w:r>
+          </w:p>
+        </w:tc>
+        <w:tc>
+          <w:tcPr>
+            <w:tcW w:type="dxa" w:w="1020"/>
+            <w:shd w:val="clear" w:color="auto" w:fill="F8F6FD"/>
+          </w:tcPr>
+          <w:p>
+            <w:pPr>
+              <w:spacing w:after="0"/>
+              <w:jc w:val="center"/>
+            </w:pPr>
+            <w:r>
+              <w:rPr>
+                <w:b/>
+                <w:i w:val="0"/>
+                <w:color w:val="5B44B8"/>
+                <w:sz w:val="18"/>
+              </w:rPr>
+              <w:t xml:space="preserve">Solo GM</w:t>
+            </w:r>
+          </w:p>
+        </w:tc>
+      </w:tr>
+      <w:tr>
+        <w:trPr>
+          <w:cantSplit w:val="true"/>
+        </w:trPr>
+        <w:tc>
+          <w:tcPr>
+            <w:tcW w:type="dxa" w:w="2041"/>
+          </w:tcPr>
+          <w:p>
+            <w:pPr>
+              <w:spacing w:after="0"/>
+            </w:pPr>
+            <w:r>
+              <w:rPr>
+                <w:b/>
+                <w:i w:val="0"/>
+                <w:sz w:val="20"/>
+              </w:rPr>
+              <w:t xml:space="preserve">Garantita dal server</w:t>
+            </w:r>
+          </w:p>
+        </w:tc>
+        <w:tc>
+          <w:tcPr>
+            <w:tcW w:type="dxa" w:w="6576"/>
+          </w:tcPr>
+          <w:p>
+            <w:pPr>
+              <w:spacing w:after="0"/>
+            </w:pPr>
+            <w:r>
+              <w:rPr>
+                <w:b w:val="0"/>
+                <w:i w:val="0"/>
+                <w:sz w:val="20"/>
+              </w:rPr>
+              <w:t xml:space="preserve">Gli oggetti nascosti stanno in un documento separato a cui il server permette l'accesso solo al GM; le modifiche non autorizzate dei giocatori vengono annullate dal server. Lo stesso vale per l'identità dei token in incognito e per i punti ferita segreti.</w:t>
             </w:r>
           </w:p>
         </w:tc>
@@ -4962,7 +6026,7 @@
                 <w:color w:val="555560"/>
                 <w:sz w:val="18"/>
               </w:rPr>
-              <w:t>Server</w:t>
+              <w:t xml:space="preserve">Server</w:t>
             </w:r>
           </w:p>
         </w:tc>
@@ -5095,7 +6159,7 @@
                 <w:i w:val="0"/>
                 <w:sz w:val="20"/>
               </w:rPr>
-              <w:t>Messaggi privati</w:t>
+              <w:t xml:space="preserve">Messaggi privati</w:t>
             </w:r>
           </w:p>
         </w:tc>
@@ -5113,7 +6177,7 @@
                 <w:i w:val="0"/>
                 <w:sz w:val="20"/>
               </w:rPr>
-              <w:t>Dalla barra laterale il GM scrive a chiunque e i giocatori scrivono al GM o tra loro. Il GM riceve copia di tutto e legge anche le conversazioni tra giocatori (senza poter rispondere), e il pannello lo dice. Ogni casella la apre solo il suo proprietario.</w:t>
+              <w:t xml:space="preserve">Dalla barra laterale il GM scrive a chiunque e i giocatori scrivono al GM o tra loro. Il GM riceve copia di tutto e legge anche le conversazioni tra giocatori (senza poter rispondere), e il pannello lo dice. Ogni casella la apre solo il suo proprietario. I messaggi possono contenere le note del GM, formattate.</w:t>
             </w:r>
           </w:p>
         </w:tc>
@@ -5133,7 +6197,7 @@
                 <w:color w:val="555560"/>
                 <w:sz w:val="18"/>
               </w:rPr>
-              <w:t>Tutti</w:t>
+              <w:t xml:space="preserve">Tutti</w:t>
             </w:r>
           </w:p>
         </w:tc>
@@ -5157,7 +6221,7 @@
                 <w:i w:val="0"/>
                 <w:sz w:val="20"/>
               </w:rPr>
-              <w:t>Dadi</w:t>
+              <w:t xml:space="preserve">Dadi</w:t>
             </w:r>
           </w:p>
         </w:tc>
@@ -5176,7 +6240,7 @@
                 <w:i w:val="0"/>
                 <w:sz w:val="20"/>
               </w:rPr>
-              <w:t>Scheda «Tavolo»: formule come 2d20kh1+5, 8d6, 4d6dl1 o d%, con dadi rapidi da d4 a d100. I tiri li fa il server, quindi nessuno può truccarli.</w:t>
+              <w:t xml:space="preserve">Scheda «Dadi»: formule come 2d20kh1+5, 8d6, 4d6dl1 o d%, con dadi rapidi da d4 a d100. I dadi possono esplodere (3d6!) e un pool può contare i successi (10d10&gt;=7); le formule scritte si salvano come pulsanti. I tiri li fa il server, quindi nessuno può truccarli.</w:t>
             </w:r>
           </w:p>
         </w:tc>
@@ -5197,7 +6261,7 @@
                 <w:color w:val="555560"/>
                 <w:sz w:val="18"/>
               </w:rPr>
-              <w:t>Tutti</w:t>
+              <w:t xml:space="preserve">Tutti</w:t>
             </w:r>
           </w:p>
         </w:tc>
@@ -5220,7 +6284,7 @@
                 <w:i w:val="0"/>
                 <w:sz w:val="20"/>
               </w:rPr>
-              <w:t>Registro pubblico</w:t>
+              <w:t xml:space="preserve">Registro pubblico</w:t>
             </w:r>
           </w:p>
         </w:tc>
@@ -5238,7 +6302,7 @@
                 <w:i w:val="0"/>
                 <w:sz w:val="20"/>
               </w:rPr>
-              <w:t>Gli ultimi 200 tiri sono visibili a tutti, con i singoli dadi e quelli scartati; ogni tiro compare anche per qualche secondo sulla lavagna.</w:t>
+              <w:t xml:space="preserve">Gli ultimi 200 tiri sono visibili a tutti, con i singoli dadi e quelli scartati; ogni tiro rotola per qualche secondo al centro della lavagna con un'animazione 2D.</w:t>
             </w:r>
           </w:p>
         </w:tc>
@@ -5258,7 +6322,7 @@
                 <w:color w:val="555560"/>
                 <w:sz w:val="18"/>
               </w:rPr>
-              <w:t>Tutti</w:t>
+              <w:t xml:space="preserve">Tutti</w:t>
             </w:r>
           </w:p>
         </w:tc>
@@ -5282,7 +6346,7 @@
                 <w:i w:val="0"/>
                 <w:sz w:val="20"/>
               </w:rPr>
-              <w:t>Tiri nascosti del GM</w:t>
+              <w:t xml:space="preserve">Tiri nascosti del GM</w:t>
             </w:r>
           </w:p>
         </w:tc>
@@ -5301,7 +6365,7 @@
                 <w:i w:val="0"/>
                 <w:sz w:val="20"/>
               </w:rPr>
-              <w:t>Con la casella «Tira di nascosto» il risultato lo vede solo il GM.</w:t>
+              <w:t xml:space="preserve">Con la casella «Tira di nascosto» il risultato lo vede solo il GM.</w:t>
             </w:r>
           </w:p>
         </w:tc>
@@ -5322,7 +6386,7 @@
                 <w:color w:val="5B44B8"/>
                 <w:sz w:val="18"/>
               </w:rPr>
-              <w:t>Solo GM</w:t>
+              <w:t xml:space="preserve">Solo GM</w:t>
             </w:r>
           </w:p>
         </w:tc>
@@ -5345,7 +6409,7 @@
                 <w:i w:val="0"/>
                 <w:sz w:val="20"/>
               </w:rPr>
-              <w:t>Comando /r</w:t>
+              <w:t xml:space="preserve">Comando /r</w:t>
             </w:r>
           </w:p>
         </w:tc>
@@ -5363,7 +6427,7 @@
                 <w:i w:val="0"/>
                 <w:sz w:val="20"/>
               </w:rPr>
-              <w:t>Scrivendo /r 1d4 in qualunque conversazione si tira per tutto il tavolo.</w:t>
+              <w:t xml:space="preserve">Scrivendo /r 1d4 in qualunque conversazione si tira per tutto il tavolo.</w:t>
             </w:r>
           </w:p>
         </w:tc>
@@ -5383,7 +6447,7 @@
                 <w:color w:val="555560"/>
                 <w:sz w:val="18"/>
               </w:rPr>
-              <w:t>Tutti</w:t>
+              <w:t xml:space="preserve">Tutti</w:t>
             </w:r>
           </w:p>
         </w:tc>
@@ -5516,7 +6580,7 @@
                 <w:i w:val="0"/>
                 <w:sz w:val="20"/>
               </w:rPr>
-              <w:t>Immagini dei token</w:t>
+              <w:t xml:space="preserve">Immagini dei token</w:t>
             </w:r>
           </w:p>
         </w:tc>
@@ -5534,7 +6598,7 @@
                 <w:i w:val="0"/>
                 <w:sz w:val="20"/>
               </w:rPr>
-              <w:t>La scheda «Genera» crea l'immagine di un token da una descrizione (ritratto, vista dall'alto o sagoma), con più varianti da scegliere.</w:t>
+              <w:t xml:space="preserve">La scheda «Genera» crea l'immagine di un token da una descrizione (ritratto, vista dall'alto o sagoma), con più varianti da scegliere.</w:t>
             </w:r>
           </w:p>
         </w:tc>
@@ -5554,7 +6618,7 @@
                 <w:color w:val="555560"/>
                 <w:sz w:val="18"/>
               </w:rPr>
-              <w:t>Tutti</w:t>
+              <w:t xml:space="preserve">Tutti</w:t>
             </w:r>
           </w:p>
         </w:tc>
@@ -5578,7 +6642,7 @@
                 <w:i w:val="0"/>
                 <w:sz w:val="20"/>
               </w:rPr>
-              <w:t>Genera mappa</w:t>
+              <w:t xml:space="preserve">Genera mappa</w:t>
             </w:r>
           </w:p>
         </w:tc>
@@ -5597,7 +6661,7 @@
                 <w:i w:val="0"/>
                 <w:sz w:val="20"/>
               </w:rPr>
-              <w:t>Da una descrizione, un tipo (dungeon o interno, esterno, regione) e un formato produce fino a 3 varianti; quella scelta va al centro della vista come mappa.</w:t>
+              <w:t xml:space="preserve">Da una descrizione, un tipo (dungeon o interno, esterno, regione) e un formato produce fino a 3 varianti; quella scelta va al centro della vista come mappa.</w:t>
             </w:r>
           </w:p>
         </w:tc>
@@ -5618,7 +6682,7 @@
                 <w:color w:val="5B44B8"/>
                 <w:sz w:val="18"/>
               </w:rPr>
-              <w:t>Solo GM</w:t>
+              <w:t xml:space="preserve">Solo GM</w:t>
             </w:r>
           </w:p>
         </w:tc>
@@ -5641,7 +6705,7 @@
                 <w:i w:val="0"/>
                 <w:sz w:val="20"/>
               </w:rPr>
-              <w:t>Traccia muri</w:t>
+              <w:t xml:space="preserve">Traccia muri</w:t>
             </w:r>
           </w:p>
         </w:tc>
@@ -5659,7 +6723,7 @@
                 <w:i w:val="0"/>
                 <w:sz w:val="20"/>
               </w:rPr>
-              <w:t>Gemini legge la mappa più grande (per le mappe animate, il primo fotogramma) e ne traccia muri, porte e finestre agganciati alla griglia; un solo annulla cancella tutto.</w:t>
+              <w:t xml:space="preserve">Gemini legge la mappa più grande (per le mappe animate, il primo fotogramma) e ne traccia muri, porte e finestre agganciati alla griglia; un solo annulla cancella tutto. I muri restano agganciati all'immagine se la si sposta.</w:t>
             </w:r>
           </w:p>
         </w:tc>
@@ -5679,7 +6743,7 @@
                 <w:color w:val="5B44B8"/>
                 <w:sz w:val="18"/>
               </w:rPr>
-              <w:t>Solo GM</w:t>
+              <w:t xml:space="preserve">Solo GM</w:t>
             </w:r>
           </w:p>
         </w:tc>
@@ -5812,7 +6876,7 @@
                 <w:i w:val="0"/>
                 <w:sz w:val="20"/>
               </w:rPr>
-              <w:t>Esporta la stanza</w:t>
+              <w:t xml:space="preserve">Esporta la stanza</w:t>
             </w:r>
           </w:p>
         </w:tc>
@@ -5830,7 +6894,7 @@
                 <w:i w:val="0"/>
                 <w:sz w:val="20"/>
               </w:rPr>
-              <w:t>Scarica un file .scryboard con tutte le scene, gli oggetti nascosti e le immagini usate (fino a 200 MB). Non contiene token, giocatori né messaggi.</w:t>
+              <w:t xml:space="preserve">Scarica un file .scryboard con tutte le scene, gli oggetti nascosti e le immagini usate (fino a 200 MB). Non contiene token, giocatori né messaggi.</w:t>
             </w:r>
           </w:p>
         </w:tc>
@@ -5850,7 +6914,7 @@
                 <w:color w:val="5B44B8"/>
                 <w:sz w:val="18"/>
               </w:rPr>
-              <w:t>Solo GM</w:t>
+              <w:t xml:space="preserve">Solo GM</w:t>
             </w:r>
           </w:p>
         </w:tc>
@@ -5874,7 +6938,7 @@
                 <w:i w:val="0"/>
                 <w:sz w:val="20"/>
               </w:rPr>
-              <w:t>Importa una stanza</w:t>
+              <w:t xml:space="preserve">Importa una stanza</w:t>
             </w:r>
           </w:p>
         </w:tc>
@@ -5893,7 +6957,7 @@
                 <w:i w:val="0"/>
                 <w:sz w:val="20"/>
               </w:rPr>
-              <w:t>Dalla home un file .scryboard diventa una stanza nuova con nuovi link. Il file non è considerato affidabile: si accettano solo dati validi e immagini il cui contenuto corrisponde al nome.</w:t>
+              <w:t xml:space="preserve">Dalla home un file .scryboard diventa una stanza nuova con nuovi link. Il file non è considerato affidabile: si accettano solo dati validi e immagini il cui contenuto corrisponde al nome.</w:t>
             </w:r>
           </w:p>
         </w:tc>
@@ -5914,7 +6978,7 @@
                 <w:color w:val="555560"/>
                 <w:sz w:val="18"/>
               </w:rPr>
-              <w:t>Tutti</w:t>
+              <w:t xml:space="preserve">Tutti</w:t>
             </w:r>
           </w:p>
         </w:tc>
@@ -5937,7 +7001,7 @@
                 <w:i w:val="0"/>
                 <w:sz w:val="20"/>
               </w:rPr>
-              <w:t>Raccolta delle immagini</w:t>
+              <w:t xml:space="preserve">Raccolta delle immagini</w:t>
             </w:r>
           </w:p>
         </w:tc>
@@ -5955,7 +7019,7 @@
                 <w:i w:val="0"/>
                 <w:sz w:val="20"/>
               </w:rPr>
-              <w:t>Tutte le immagini caricate nella stanza si ritrovano nella scheda «Caricati» della libreria.</w:t>
+              <w:t xml:space="preserve">Tutte le immagini caricate nella stanza si ritrovano nella scheda «Caricati» della libreria.</w:t>
             </w:r>
           </w:p>
         </w:tc>
@@ -5975,7 +7039,7 @@
                 <w:color w:val="555560"/>
                 <w:sz w:val="18"/>
               </w:rPr>
-              <w:t>Tutti</w:t>
+              <w:t xml:space="preserve">Tutti</w:t>
             </w:r>
           </w:p>
         </w:tc>
@@ -6087,7 +7151,7 @@
                 <w:i w:val="0"/>
                 <w:sz w:val="20"/>
               </w:rPr>
-              <w:t>V H P L R O T E K</w:t>
+              <w:t xml:space="preserve">V H Q P L R O T E K C</w:t>
             </w:r>
           </w:p>
         </w:tc>
@@ -6105,7 +7169,7 @@
                 <w:i w:val="0"/>
                 <w:sz w:val="20"/>
               </w:rPr>
-              <w:t>Seleziona, mano, matita, linea, rettangolo, ellisse, testo, gomma, token</w:t>
+              <w:t xml:space="preserve">Seleziona, mano, puntatore laser, matita, linea, rettangolo, ellisse, testo, gomma, token, collega</w:t>
             </w:r>
           </w:p>
         </w:tc>
@@ -6129,7 +7193,7 @@
                 <w:i w:val="0"/>
                 <w:sz w:val="20"/>
               </w:rPr>
-              <w:t>M</w:t>
+              <w:t xml:space="preserve">M</w:t>
             </w:r>
           </w:p>
         </w:tc>
@@ -6148,7 +7212,7 @@
                 <w:i w:val="0"/>
                 <w:sz w:val="20"/>
               </w:rPr>
-              <w:t>Righello e sagome d'area</w:t>
+              <w:t xml:space="preserve">Righello e sagome d'area</w:t>
             </w:r>
           </w:p>
         </w:tc>
@@ -6171,7 +7235,7 @@
                 <w:i w:val="0"/>
                 <w:sz w:val="20"/>
               </w:rPr>
-              <w:t>B · J · W · I · S · F</w:t>
+              <w:t xml:space="preserve">B · J · W · I · S · F · A · U</w:t>
             </w:r>
           </w:p>
         </w:tc>
@@ -6189,7 +7253,7 @@
                 <w:i w:val="0"/>
                 <w:sz w:val="20"/>
               </w:rPr>
-              <w:t>Solo GM: terreno, percorso, muri, luci, timbri, nebbia</w:t>
+              <w:t xml:space="preserve">Solo GM: terreno, percorso, muri, luci, timbri, nebbia, note, tetti</w:t>
             </w:r>
           </w:p>
         </w:tc>
@@ -6213,7 +7277,7 @@
                 <w:i w:val="0"/>
                 <w:sz w:val="20"/>
               </w:rPr>
-              <w:t>N</w:t>
+              <w:t xml:space="preserve">N</w:t>
             </w:r>
           </w:p>
         </w:tc>
@@ -6232,7 +7296,7 @@
                 <w:i w:val="0"/>
                 <w:sz w:val="20"/>
               </w:rPr>
-              <w:t>Solo GM: turno successivo</w:t>
+              <w:t xml:space="preserve">Solo GM: turno successivo</w:t>
             </w:r>
           </w:p>
         </w:tc>
@@ -6255,7 +7319,7 @@
                 <w:i w:val="0"/>
                 <w:sz w:val="20"/>
               </w:rPr>
-              <w:t>Spazio (tenuto premuto)</w:t>
+              <w:t xml:space="preserve">D</w:t>
             </w:r>
           </w:p>
         </w:tc>
@@ -6273,7 +7337,7 @@
                 <w:i w:val="0"/>
                 <w:sz w:val="20"/>
               </w:rPr>
-              <w:t>Sposta la vista con qualsiasi strumento; durante una misura aggiunge una tappa</w:t>
+              <w:t xml:space="preserve">Danno o cura per i token selezionati</w:t>
             </w:r>
           </w:p>
         </w:tc>
@@ -6297,7 +7361,7 @@
                 <w:i w:val="0"/>
                 <w:sz w:val="20"/>
               </w:rPr>
-              <w:t>Alt (trascinando)</w:t>
+              <w:t xml:space="preserve">Ctrl+D</w:t>
             </w:r>
           </w:p>
         </w:tc>
@@ -6316,7 +7380,7 @@
                 <w:i w:val="0"/>
                 <w:sz w:val="20"/>
               </w:rPr>
-              <w:t>Muove o disegna senza agganciare alla griglia; il GM con Alt ignora anche i muri</w:t>
+              <w:t xml:space="preserve">Duplica la selezione</w:t>
             </w:r>
           </w:p>
         </w:tc>
@@ -6339,7 +7403,7 @@
                 <w:i w:val="0"/>
                 <w:sz w:val="20"/>
               </w:rPr>
-              <w:t>Maiusc+H</w:t>
+              <w:t xml:space="preserve">Spazio (tenuto premuto)</w:t>
             </w:r>
           </w:p>
         </w:tc>
@@ -6357,7 +7421,7 @@
                 <w:i w:val="0"/>
                 <w:sz w:val="20"/>
               </w:rPr>
-              <w:t>Solo GM: nasconde o rivela la selezione</w:t>
+              <w:t xml:space="preserve">Sposta la vista con qualsiasi strumento; durante una misura aggiunge una tappa</w:t>
             </w:r>
           </w:p>
         </w:tc>
@@ -6381,7 +7445,7 @@
                 <w:i w:val="0"/>
                 <w:sz w:val="20"/>
               </w:rPr>
-              <w:t>Pressione prolungata</w:t>
+              <w:t xml:space="preserve">Alt (trascinando)</w:t>
             </w:r>
           </w:p>
         </w:tc>
@@ -6400,7 +7464,7 @@
                 <w:i w:val="0"/>
                 <w:sz w:val="20"/>
               </w:rPr>
-              <w:t>Ping visibile a tutti; con Maiusc, il GM richiama anche i giocatori</w:t>
+              <w:t xml:space="preserve">Muove o disegna senza agganciare alla griglia; il GM con Alt ignora anche i muri</w:t>
             </w:r>
           </w:p>
         </w:tc>
@@ -6423,7 +7487,7 @@
                 <w:i w:val="0"/>
                 <w:sz w:val="20"/>
               </w:rPr>
-              <w:t>Rotella / pinch</w:t>
+              <w:t xml:space="preserve">Maiusc+H</w:t>
             </w:r>
           </w:p>
         </w:tc>
@@ -6441,7 +7505,7 @@
                 <w:i w:val="0"/>
                 <w:sz w:val="20"/>
               </w:rPr>
-              <w:t>Zoom</w:t>
+              <w:t xml:space="preserve">Solo GM: nasconde o rivela la selezione</w:t>
             </w:r>
           </w:p>
         </w:tc>
@@ -6465,7 +7529,7 @@
                 <w:i w:val="0"/>
                 <w:sz w:val="20"/>
               </w:rPr>
-              <w:t>Maiusc+1 / Maiusc+0</w:t>
+              <w:t xml:space="preserve">Pressione prolungata</w:t>
             </w:r>
           </w:p>
         </w:tc>
@@ -6484,7 +7548,7 @@
                 <w:i w:val="0"/>
                 <w:sz w:val="20"/>
               </w:rPr>
-              <w:t>Adatta al contenuto / zoom al 100%</w:t>
+              <w:t xml:space="preserve">Ping visibile a tutti; con Maiusc, il GM richiama anche i giocatori</w:t>
             </w:r>
           </w:p>
         </w:tc>
@@ -6507,7 +7571,7 @@
                 <w:i w:val="0"/>
                 <w:sz w:val="20"/>
               </w:rPr>
-              <w:t>Canc / Backspace</w:t>
+              <w:t xml:space="preserve">Rotella / pinch</w:t>
             </w:r>
           </w:p>
         </w:tc>
@@ -6525,7 +7589,7 @@
                 <w:i w:val="0"/>
                 <w:sz w:val="20"/>
               </w:rPr>
-              <w:t>Elimina la selezione</w:t>
+              <w:t xml:space="preserve">Zoom</w:t>
             </w:r>
           </w:p>
         </w:tc>
@@ -6549,7 +7613,7 @@
                 <w:i w:val="0"/>
                 <w:sz w:val="20"/>
               </w:rPr>
-              <w:t>[ e ]</w:t>
+              <w:t xml:space="preserve">Maiusc+1 / Maiusc+0</w:t>
             </w:r>
           </w:p>
         </w:tc>
@@ -6568,7 +7632,7 @@
                 <w:i w:val="0"/>
                 <w:sz w:val="20"/>
               </w:rPr>
-              <w:t>Manda indietro / porta avanti</w:t>
+              <w:t xml:space="preserve">Adatta al contenuto / zoom al 100%</w:t>
             </w:r>
           </w:p>
         </w:tc>
@@ -6591,7 +7655,7 @@
                 <w:i w:val="0"/>
                 <w:sz w:val="20"/>
               </w:rPr>
-              <w:t>Ctrl+Z / Ctrl+Maiusc+Z</w:t>
+              <w:t xml:space="preserve">Canc / Backspace</w:t>
             </w:r>
           </w:p>
         </w:tc>
@@ -6609,7 +7673,7 @@
                 <w:i w:val="0"/>
                 <w:sz w:val="20"/>
               </w:rPr>
-              <w:t>Annulla / ripeti</w:t>
+              <w:t xml:space="preserve">Elimina la selezione</w:t>
             </w:r>
           </w:p>
         </w:tc>
@@ -6633,7 +7697,7 @@
                 <w:i w:val="0"/>
                 <w:sz w:val="20"/>
               </w:rPr>
-              <w:t>Esc</w:t>
+              <w:t xml:space="preserve">[ e ]</w:t>
             </w:r>
           </w:p>
         </w:tc>
@@ -6652,7 +7716,91 @@
                 <w:i w:val="0"/>
                 <w:sz w:val="20"/>
               </w:rPr>
-              <w:t>Deseleziona, annulla una misura o un aggancio</w:t>
+              <w:t xml:space="preserve">Manda indietro / porta avanti</w:t>
+            </w:r>
+          </w:p>
+        </w:tc>
+      </w:tr>
+      <w:tr>
+        <w:trPr>
+          <w:cantSplit w:val="true"/>
+        </w:trPr>
+        <w:tc>
+          <w:tcPr>
+            <w:tcW w:type="dxa" w:w="2835"/>
+          </w:tcPr>
+          <w:p>
+            <w:pPr>
+              <w:spacing w:after="0"/>
+            </w:pPr>
+            <w:r>
+              <w:rPr>
+                <w:b/>
+                <w:i w:val="0"/>
+                <w:sz w:val="20"/>
+              </w:rPr>
+              <w:t xml:space="preserve">Ctrl+Z / Ctrl+Maiusc+Z</w:t>
+            </w:r>
+          </w:p>
+        </w:tc>
+        <w:tc>
+          <w:tcPr>
+            <w:tcW w:type="dxa" w:w="6803"/>
+          </w:tcPr>
+          <w:p>
+            <w:pPr>
+              <w:spacing w:after="0"/>
+            </w:pPr>
+            <w:r>
+              <w:rPr>
+                <w:b w:val="0"/>
+                <w:i w:val="0"/>
+                <w:sz w:val="20"/>
+              </w:rPr>
+              <w:t xml:space="preserve">Annulla / ripeti</w:t>
+            </w:r>
+          </w:p>
+        </w:tc>
+      </w:tr>
+      <w:tr>
+        <w:trPr>
+          <w:cantSplit w:val="true"/>
+        </w:trPr>
+        <w:tc>
+          <w:tcPr>
+            <w:tcW w:type="dxa" w:w="2835"/>
+            <w:shd w:val="clear" w:color="auto" w:fill="F8F6FD"/>
+          </w:tcPr>
+          <w:p>
+            <w:pPr>
+              <w:spacing w:after="0"/>
+            </w:pPr>
+            <w:r>
+              <w:rPr>
+                <w:b/>
+                <w:i w:val="0"/>
+                <w:sz w:val="20"/>
+              </w:rPr>
+              <w:t xml:space="preserve">Esc</w:t>
+            </w:r>
+          </w:p>
+        </w:tc>
+        <w:tc>
+          <w:tcPr>
+            <w:tcW w:type="dxa" w:w="6803"/>
+            <w:shd w:val="clear" w:color="auto" w:fill="F8F6FD"/>
+          </w:tcPr>
+          <w:p>
+            <w:pPr>
+              <w:spacing w:after="0"/>
+            </w:pPr>
+            <w:r>
+              <w:rPr>
+                <w:b w:val="0"/>
+                <w:i w:val="0"/>
+                <w:sz w:val="20"/>
+              </w:rPr>
+              <w:t xml:space="preserve">Deseleziona, annulla una misura o un aggancio</w:t>
             </w:r>
           </w:p>
         </w:tc>
@@ -7053,6 +8201,30 @@
       </w:pPr>
       <w:r>
         <w:t>I tiri nascosti del GM restano nel suo browser e si perdono ricaricando la pagina.</w:t>
+      </w:r>
+    </w:p>
+    <w:p>
+      <w:pPr>
+        <w:pStyle w:val="ListBullet"/>
+      </w:pPr>
+      <w:r>
+        <w:t xml:space="preserve">Punti ferita e condizioni sono contatori ed etichette: Scryboard non ne trae conseguenze (un token stordito si muove come prima, uno a 0 PF resta sulla mappa).</w:t>
+      </w:r>
+    </w:p>
+    <w:p>
+      <w:pPr>
+        <w:pStyle w:val="ListBullet"/>
+      </w:pPr>
+      <w:r>
+        <w:t xml:space="preserve">«Indietro» nel pannello dei turni non restituisce i round già scalati alle condizioni: per quello c'è Ctrl+Z.</w:t>
+      </w:r>
+    </w:p>
+    <w:p>
+      <w:pPr>
+        <w:pStyle w:val="ListBullet"/>
+      </w:pPr>
+      <w:r>
+        <w:t xml:space="preserve">Lo schermo al tavolo non si disconnette mai per inattività, quindi tiene acceso il server finché resta aperto.</w:t>
       </w:r>
     </w:p>
     <w:sectPr>

</xml_diff>

<commit_message>
Aggiorna documento Word con controlli touch e dispositivi pieghevoli
</commit_message>
<xml_diff>
--- a/docs/Scryboard-Funzionalita.docx
+++ b/docs/Scryboard-Funzionalita.docx
@@ -1,6 +1,6 @@
 
 <file path=word/document.xml><?xml version="1.0" encoding="utf-8"?>
-<w:document xmlns:wpc="http://schemas.microsoft.com/office/word/2010/wordprocessingCanvas" xmlns:mo="http://schemas.microsoft.com/office/mac/office/2008/main" xmlns:mc="http://schemas.openxmlformats.org/markup-compatibility/2006" xmlns:mv="urn:schemas-microsoft-com:mac:vml" xmlns:o="urn:schemas-microsoft-com:office:office" xmlns:r="http://schemas.openxmlformats.org/officeDocument/2006/relationships" xmlns:m="http://schemas.openxmlformats.org/officeDocument/2006/math" xmlns:v="urn:schemas-microsoft-com:vml" xmlns:wp14="http://schemas.microsoft.com/office/word/2010/wordprocessingDrawing" xmlns:wp="http://schemas.openxmlformats.org/drawingml/2006/wordprocessingDrawing" xmlns:w10="urn:schemas-microsoft-com:office:word" xmlns:w="http://schemas.openxmlformats.org/wordprocessingml/2006/main" xmlns:w14="http://schemas.microsoft.com/office/word/2010/wordml" xmlns:wpg="http://schemas.microsoft.com/office/word/2010/wordprocessingGroup" xmlns:wpi="http://schemas.microsoft.com/office/word/2010/wordprocessingInk" xmlns:wne="http://schemas.microsoft.com/office/word/2006/wordml" xmlns:wps="http://schemas.microsoft.com/office/word/2010/wordprocessingShape" mc:Ignorable="w14 wp14">
+<w:document xmlns:ns1="http://schemas.openxmlformats.org/markup-compatibility/2006" xmlns:r="http://schemas.openxmlformats.org/officeDocument/2006/relationships" xmlns:w="http://schemas.openxmlformats.org/wordprocessingml/2006/main" ns1:Ignorable="w14 wp14">
   <w:body>
     <w:p>
       <w:pPr>
@@ -238,7 +238,7 @@
           <w:i/>
           <w:color w:val="555560"/>
         </w:rPr>
-        <w:t>In totale: 12 aree e 88 funzionalità descritte.</w:t>
+        <w:t>In totale: 12 aree e 91 funzionalità descritte.</w:t>
       </w:r>
     </w:p>
     <w:p>
@@ -2188,6 +2188,189 @@
           </w:p>
         </w:tc>
       </w:tr>
+      <w:tr>
+        <w:trPr>
+          <w:cantSplit w:val="true"/>
+        </w:trPr>
+        <w:tc>
+          <w:tcPr>
+            <w:tcW w:type="dxa" w:w="2041"/>
+          </w:tcPr>
+          <w:p>
+            <w:pPr>
+              <w:spacing w:after="0"/>
+            </w:pPr>
+            <w:r>
+              <w:rPr>
+                <w:b/>
+                <w:i w:val="0"/>
+                <w:sz w:val="20"/>
+              </w:rPr>
+              <w:t xml:space="preserve">Controlli touch e gesti multi-touch</w:t>
+            </w:r>
+          </w:p>
+        </w:tc>
+        <w:tc>
+          <w:tcPr>
+            <w:tcW w:type="dxa" w:w="6576"/>
+          </w:tcPr>
+          <w:p>
+            <w:pPr>
+              <w:spacing w:after="0"/>
+            </w:pPr>
+            <w:r>
+              <w:rPr>
+                <w:b w:val="0"/>
+                <w:i w:val="0"/>
+                <w:sz w:val="20"/>
+              </w:rPr>
+              <w:t xml:space="preserve">Spostamento della vista (pan) e zoom proporzionale a 2 dita simultanei ancorati al baricentro dinamico; cancellazione automatica dell'azione monomano al tocco della seconda mano; tap a 2 dita per Annulla e tap a 3 dita per Ripeti.</w:t>
+            </w:r>
+          </w:p>
+        </w:tc>
+        <w:tc>
+          <w:tcPr>
+            <w:tcW w:type="dxa" w:w="1020"/>
+          </w:tcPr>
+          <w:p>
+            <w:pPr>
+              <w:spacing w:after="0"/>
+              <w:jc w:val="center"/>
+            </w:pPr>
+            <w:r>
+              <w:rPr>
+                <w:b w:val="0"/>
+                <w:i w:val="0"/>
+                <w:color w:val="555560"/>
+                <w:sz w:val="18"/>
+              </w:rPr>
+              <w:t xml:space="preserve">Tutti</w:t>
+            </w:r>
+          </w:p>
+        </w:tc>
+      </w:tr>
+      <w:tr>
+        <w:trPr>
+          <w:cantSplit w:val="true"/>
+        </w:trPr>
+        <w:tc>
+          <w:tcPr>
+            <w:tcW w:type="dxa" w:w="2041"/>
+          </w:tcPr>
+          <w:p>
+            <w:pPr>
+              <w:spacing w:after="0"/>
+            </w:pPr>
+            <w:r>
+              <w:rPr>
+                <w:b/>
+                <w:i w:val="0"/>
+                <w:sz w:val="20"/>
+              </w:rPr>
+              <w:t xml:space="preserve">Modificatori touch a schermo</w:t>
+            </w:r>
+          </w:p>
+        </w:tc>
+        <w:tc>
+          <w:tcPr>
+            <w:tcW w:type="dxa" w:w="6576"/>
+          </w:tcPr>
+          <w:p>
+            <w:pPr>
+              <w:spacing w:after="0"/>
+            </w:pPr>
+            <w:r>
+              <w:rPr>
+                <w:b w:val="0"/>
+                <w:i w:val="0"/>
+                <w:sz w:val="20"/>
+              </w:rPr>
+              <w:t xml:space="preserve">Pulsanti touch nella barra per attivare la selezione multipla cumulativa con singoli tocchi (equivale a Maiusc) e il movimento o righello liberi senza snap alla griglia per token e muri (equivale ad Alt).</w:t>
+            </w:r>
+          </w:p>
+        </w:tc>
+        <w:tc>
+          <w:tcPr>
+            <w:tcW w:type="dxa" w:w="1020"/>
+          </w:tcPr>
+          <w:p>
+            <w:pPr>
+              <w:spacing w:after="0"/>
+              <w:jc w:val="center"/>
+            </w:pPr>
+            <w:r>
+              <w:rPr>
+                <w:b w:val="0"/>
+                <w:i w:val="0"/>
+                <w:color w:val="555560"/>
+                <w:sz w:val="18"/>
+              </w:rPr>
+              <w:t xml:space="preserve">Tutti</w:t>
+            </w:r>
+          </w:p>
+        </w:tc>
+      </w:tr>
+      <w:tr>
+        <w:trPr>
+          <w:cantSplit w:val="true"/>
+        </w:trPr>
+        <w:tc>
+          <w:tcPr>
+            <w:tcW w:type="dxa" w:w="2041"/>
+          </w:tcPr>
+          <w:p>
+            <w:pPr>
+              <w:spacing w:after="0"/>
+            </w:pPr>
+            <w:r>
+              <w:rPr>
+                <w:b/>
+                <w:i w:val="0"/>
+                <w:sz w:val="20"/>
+              </w:rPr>
+              <w:t xml:space="preserve">Dispositivi pieghevoli e Flex Mode</w:t>
+            </w:r>
+          </w:p>
+        </w:tc>
+        <w:tc>
+          <w:tcPr>
+            <w:tcW w:type="dxa" w:w="6576"/>
+          </w:tcPr>
+          <w:p>
+            <w:pPr>
+              <w:spacing w:after="0"/>
+            </w:pPr>
+            <w:r>
+              <w:rPr>
+                <w:b w:val="0"/>
+                <w:i w:val="0"/>
+                <w:sz w:val="20"/>
+              </w:rPr>
+              <w:t xml:space="preserve">Supporto per smartphone foldable (W3C Device Posture API e toggle rapido): a 90° su un tavolo (tabletop) la mappa si posiziona sullo schermo inclinato in alto e la console con chat, dadi e partecipanti in basso; postura a libro a 2 pagine in verticale.</w:t>
+            </w:r>
+          </w:p>
+        </w:tc>
+        <w:tc>
+          <w:tcPr>
+            <w:tcW w:type="dxa" w:w="1020"/>
+          </w:tcPr>
+          <w:p>
+            <w:pPr>
+              <w:spacing w:after="0"/>
+              <w:jc w:val="center"/>
+            </w:pPr>
+            <w:r>
+              <w:rPr>
+                <w:b w:val="0"/>
+                <w:i w:val="0"/>
+                <w:color w:val="555560"/>
+                <w:sz w:val="18"/>
+              </w:rPr>
+              <w:t xml:space="preserve">Tutti</w:t>
+            </w:r>
+          </w:p>
+        </w:tc>
+      </w:tr>
     </w:tbl>
     <w:p>
       <w:pPr>
@@ -7805,6 +7988,129 @@
           </w:p>
         </w:tc>
       </w:tr>
+      <w:tr>
+        <w:trPr>
+          <w:cantSplit w:val="true"/>
+        </w:trPr>
+        <w:tc>
+          <w:tcPr>
+            <w:tcW w:type="dxa" w:w="2835"/>
+          </w:tcPr>
+          <w:p>
+            <w:pPr>
+              <w:spacing w:after="0"/>
+            </w:pPr>
+            <w:r>
+              <w:rPr>
+                <w:b/>
+                <w:i w:val="0"/>
+                <w:sz w:val="20"/>
+              </w:rPr>
+              <w:t xml:space="preserve">Pinch / Pan a due dita</w:t>
+            </w:r>
+          </w:p>
+        </w:tc>
+        <w:tc>
+          <w:tcPr>
+            <w:tcW w:type="dxa" w:w="6803"/>
+          </w:tcPr>
+          <w:p>
+            <w:pPr>
+              <w:spacing w:after="0"/>
+            </w:pPr>
+            <w:r>
+              <w:rPr>
+                <w:b w:val="0"/>
+                <w:i w:val="0"/>
+                <w:sz w:val="20"/>
+              </w:rPr>
+              <w:t xml:space="preserve">Zoom proporzionale e spostamento contemporanei ancorati alle dita</w:t>
+            </w:r>
+          </w:p>
+        </w:tc>
+      </w:tr>
+      <w:tr>
+        <w:trPr>
+          <w:cantSplit w:val="true"/>
+        </w:trPr>
+        <w:tc>
+          <w:tcPr>
+            <w:tcW w:type="dxa" w:w="2835"/>
+          </w:tcPr>
+          <w:p>
+            <w:pPr>
+              <w:spacing w:after="0"/>
+            </w:pPr>
+            <w:r>
+              <w:rPr>
+                <w:b/>
+                <w:i w:val="0"/>
+                <w:sz w:val="20"/>
+              </w:rPr>
+              <w:t xml:space="preserve">Tap a due / tre dita</w:t>
+            </w:r>
+          </w:p>
+        </w:tc>
+        <w:tc>
+          <w:tcPr>
+            <w:tcW w:type="dxa" w:w="6803"/>
+          </w:tcPr>
+          <w:p>
+            <w:pPr>
+              <w:spacing w:after="0"/>
+            </w:pPr>
+            <w:r>
+              <w:rPr>
+                <w:b w:val="0"/>
+                <w:i w:val="0"/>
+                <w:sz w:val="20"/>
+              </w:rPr>
+              <w:t xml:space="preserve">Annulla (tap a 2 dita) / Ripeti (tap a 3 dita)</w:t>
+            </w:r>
+          </w:p>
+        </w:tc>
+      </w:tr>
+      <w:tr>
+        <w:trPr>
+          <w:cantSplit w:val="true"/>
+        </w:trPr>
+        <w:tc>
+          <w:tcPr>
+            <w:tcW w:type="dxa" w:w="2835"/>
+          </w:tcPr>
+          <w:p>
+            <w:pPr>
+              <w:spacing w:after="0"/>
+            </w:pPr>
+            <w:r>
+              <w:rPr>
+                <w:b/>
+                <w:i w:val="0"/>
+                <w:sz w:val="20"/>
+              </w:rPr>
+              <w:t xml:space="preserve">Icone touch (barra zoom)</w:t>
+            </w:r>
+          </w:p>
+        </w:tc>
+        <w:tc>
+          <w:tcPr>
+            <w:tcW w:type="dxa" w:w="6803"/>
+          </w:tcPr>
+          <w:p>
+            <w:pPr>
+              <w:spacing w:after="0"/>
+            </w:pPr>
+            <w:r>
+              <w:rPr>
+                <w:b w:val="0"/>
+                <w:i w:val="0"/>
+                <w:sz w:val="20"/>
+              </w:rPr>
+              <w:t xml:space="preserve">Selezione multipla (Maiusc), Movimento libero (Alt), Modalità Flex (90°)</w:t>
+            </w:r>
+          </w:p>
+        </w:tc>
+      </w:tr>
     </w:tbl>
     <w:p>
       <w:pPr>
@@ -7925,7 +8231,7 @@
                 <w:i w:val="0"/>
                 <w:sz w:val="20"/>
               </w:rPr>
-              <w:t>Applicazione web: nessuna installazione. Funziona su Chrome, Edge, Firefox e Safari.</w:t>
+              <w:t>Applicazione web: nessuna installazione. Funziona su Chrome, Edge, Firefox e Safari. Supporto touch nativo per tablet (iPad, Android) e dispositivi pieghevoli con W3C Device Posture API.</w:t>
             </w:r>
           </w:p>
         </w:tc>

</xml_diff>

<commit_message>
Aggiorna documento Word con generazione timbri, libreria asset e ombre quota
- Aggiunge in §11 «Genera timbri» e «Libreria asset generati» persistente cross-room (IndexedDB)
- Aggiorna in §6 «Quota» con elevazione, ombre dinamiche e misura dislivelli 3D
- Aggiorna in §14 «Protezioni» con CSP, header di sicurezza, guard Yjs e validazione WebSocket
- Riflette il totale di 93 funzionalità nelle 12 aree
</commit_message>
<xml_diff>
--- a/docs/Scryboard-Funzionalita.docx
+++ b/docs/Scryboard-Funzionalita.docx
@@ -1,6 +1,6 @@
 
 <file path=word/document.xml><?xml version="1.0" encoding="utf-8"?>
-<w:document xmlns:ns1="http://schemas.openxmlformats.org/markup-compatibility/2006" xmlns:r="http://schemas.openxmlformats.org/officeDocument/2006/relationships" xmlns:w="http://schemas.openxmlformats.org/wordprocessingml/2006/main" ns1:Ignorable="w14 wp14">
+<w:document xmlns:mc="http://schemas.openxmlformats.org/markup-compatibility/2006" xmlns:r="http://schemas.openxmlformats.org/officeDocument/2006/relationships" xmlns:w="http://schemas.openxmlformats.org/wordprocessingml/2006/main" mc:Ignorable="w14 wp14">
   <w:body>
     <w:p>
       <w:pPr>
@@ -238,7 +238,7 @@
           <w:i/>
           <w:color w:val="555560"/>
         </w:rPr>
-        <w:t>In totale: 12 aree e 91 funzionalità descritte.</w:t>
+        <w:t>In totale: 12 aree e 93 funzionalità descritte.</w:t>
       </w:r>
     </w:p>
     <w:p>
@@ -3925,7 +3925,7 @@
                 <w:i w:val="0"/>
                 <w:sz w:val="20"/>
               </w:rPr>
-              <w:t xml:space="preserve">Volo, balconate, fosse: la quota nell'unità del righello compare come pillola sopra il token («+15 ft») e il righello misura anche il dislivello.</w:t>
+              <w:t xml:space="preserve">Volo, balconate, fosse: la quota nell'unità del righello compare come pillola sopra il token («+15 ft») e il righello calcola la distanza reale in 3D. I token sollevati (quota positiva) proiettano un'ombra ellittica dinamica sfumata sul pavimento della griglia (effetto galleggiamento/volo); a quota negativa sprofondano con orlo e ombreggiatura da fossa.</w:t>
             </w:r>
           </w:p>
         </w:tc>
@@ -4847,7 +4847,7 @@
                 <w:i w:val="0"/>
                 <w:sz w:val="20"/>
               </w:rPr>
-              <w:t xml:space="preserve">Dieci elementi di scenario (albero, pino, cespuglio, roccia, masso, barile, cassa, tavolo, sedia, letto), con rotazione, taglia e variante casuali; trascinando se ne spargono molti.</w:t>
+              <w:t xml:space="preserve">Dieci elementi di scenario (albero, pino, cespuglio, roccia, masso, barile, cassa, tavolo, sedia, letto), con rotazione, taglia e variante casuali; trascinando se ne spargono molti. Possono essere arricchiti con timbri personalizzati generati da Gemini (§11).</w:t>
             </w:r>
           </w:p>
         </w:tc>
@@ -6651,7 +6651,7 @@
     </w:p>
     <w:p>
       <w:r>
-        <w:t>Con una chiave API di Gemini, salvata dalle Impostazioni, compaiono tre funzioni. La chiave resta nel browser dell'utente e non passa mai dal server di Scryboard; le richieste sono addebitate sul conto Google della chiave.</w:t>
+        <w:t>Con una chiave API di Gemini, salvata dalle Impostazioni, compaiono funzioni generative per token, timbri, mappe e tracciamento muri. Gli asset generati vengono conservati in una raccolta persistente riutilizzabile tra stanze diverse. La chiave resta nel browser dell'utente e non passa mai dal server di Scryboard; le richieste sono addebitate sul conto Google della chiave.</w:t>
       </w:r>
     </w:p>
     <w:tbl>
@@ -6927,6 +6927,131 @@
                 <w:sz w:val="18"/>
               </w:rPr>
               <w:t xml:space="preserve">Solo GM</w:t>
+            </w:r>
+          </w:p>
+        </w:tc>
+      </w:tr>
+      <w:tr>
+        <w:trPr>
+          <w:cantSplit w:val="true"/>
+        </w:trPr>
+        <w:tc>
+          <w:tcPr>
+            <w:tcW w:type="dxa" w:w="2041"/>
+            <w:shd w:val="clear" w:color="auto" w:fill="F8F6FD"/>
+          </w:tcPr>
+          <w:p>
+            <w:pPr>
+              <w:spacing w:after="0"/>
+            </w:pPr>
+            <w:r>
+              <w:rPr>
+                <w:b/>
+                <w:i w:val="0"/>
+                <w:sz w:val="20"/>
+              </w:rPr>
+              <w:t xml:space="preserve">Genera timbri</w:t>
+            </w:r>
+          </w:p>
+        </w:tc>
+        <w:tc>
+          <w:tcPr>
+            <w:tcW w:type="dxa" w:w="6576"/>
+            <w:shd w:val="clear" w:color="auto" w:fill="F8F6FD"/>
+          </w:tcPr>
+          <w:p>
+            <w:pPr>
+              <w:spacing w:after="0"/>
+            </w:pPr>
+            <w:r>
+              <w:rPr>
+                <w:b w:val="0"/>
+                <w:i w:val="0"/>
+                <w:sz w:val="20"/>
+              </w:rPr>
+              <w:t xml:space="preserve">Nel pannello Timbri il GM può generare immagini trasparenti di elementi scenici o oggetti (alberi, forzieri, trappole, statue, arredi...) a partire da un prompt o da suggerimenti pronti, con isolamento automatico del soggetto e scelta della dimensione in caselle.</w:t>
+            </w:r>
+          </w:p>
+        </w:tc>
+        <w:tc>
+          <w:tcPr>
+            <w:tcW w:type="dxa" w:w="1020"/>
+            <w:shd w:val="clear" w:color="auto" w:fill="F8F6FD"/>
+          </w:tcPr>
+          <w:p>
+            <w:pPr>
+              <w:spacing w:after="0"/>
+              <w:jc w:val="center"/>
+            </w:pPr>
+            <w:r>
+              <w:rPr>
+                <w:b w:val="0"/>
+                <w:i w:val="0"/>
+                <w:color w:val="555560"/>
+                <w:sz w:val="18"/>
+              </w:rPr>
+              <w:t xml:space="preserve">Solo GM</w:t>
+            </w:r>
+          </w:p>
+        </w:tc>
+      </w:tr>
+      <w:tr>
+        <w:trPr>
+          <w:cantSplit w:val="true"/>
+        </w:trPr>
+        <w:tc>
+          <w:tcPr>
+            <w:tcW w:type="dxa" w:w="2041"/>
+          </w:tcPr>
+          <w:p>
+            <w:pPr>
+              <w:spacing w:after="0"/>
+            </w:pPr>
+            <w:r>
+              <w:rPr>
+                <w:b/>
+                <w:i w:val="0"/>
+                <w:sz w:val="20"/>
+              </w:rPr>
+              <w:t xml:space="preserve">Libreria asset generati</w:t>
+            </w:r>
+          </w:p>
+        </w:tc>
+        <w:tc>
+          <w:tcPr>
+            <w:tcW w:type="dxa" w:w="6576"/>
+          </w:tcPr>
+          <w:p>
+            <w:pPr>
+              <w:spacing w:after="0"/>
+            </w:pPr>
+            <w:r>
+              <w:rPr>
+                <w:b w:val="0"/>
+                <w:i w:val="0"/>
+                <w:sz w:val="20"/>
+              </w:rPr>
+              <w:t xml:space="preserve">Tutti gli asset creati con Gemini (ritratti di token, mappe e timbri) vengono memorizzati in una raccolta persistente locale nel browser (IndexedDB). Possono essere sfogliati con miniature, eliminati o inseriti istantaneamente in qualsiasi altra stanza senza doverli rigenerare né riusare token API.</w:t>
+            </w:r>
+          </w:p>
+        </w:tc>
+        <w:tc>
+          <w:tcPr>
+            <w:tcW w:type="dxa" w:w="1020"/>
+          </w:tcPr>
+          <w:p>
+            <w:pPr>
+              <w:spacing w:after="0"/>
+              <w:jc w:val="center"/>
+            </w:pPr>
+            <w:r>
+              <w:rPr>
+                <w:b w:val="0"/>
+                <w:i w:val="0"/>
+                <w:color w:val="555560"/>
+                <w:sz w:val="18"/>
+              </w:rPr>
+              <w:t xml:space="preserve">Tutti</w:t>
             </w:r>
           </w:p>
         </w:tc>
@@ -7202,7 +7327,7 @@
                 <w:i w:val="0"/>
                 <w:sz w:val="20"/>
               </w:rPr>
-              <w:t xml:space="preserve">Tutte le immagini caricate nella stanza si ritrovano nella scheda «Caricati» della libreria.</w:t>
+              <w:t xml:space="preserve">Tutte le immagini caricate nella stanza si ritrovano nella scheda «Caricati» della libreria; gli asset generati con Gemini sono disponibili e riutilizzabili tra stanze diverse nella libreria persistente locale.</w:t>
             </w:r>
           </w:p>
         </w:tc>
@@ -8399,7 +8524,7 @@
                 <w:i w:val="0"/>
                 <w:sz w:val="20"/>
               </w:rPr>
-              <w:t>Limiti di richieste per indirizzo (stanze, caricamenti, messaggi, tiri); validazione di tutti i dati sul server; controllo dei tipi di file dai primi byte.</w:t>
+              <w:t>Intestazioni di sicurezza web (CSP rigoroso, X-Frame-Options DENY, no-sniff); protezione WebSocket con verifica Origin; guard Yjs con rollback atomico e vincoli di ruolo; sanitizzazione nomi riservati (GM); validazione Zod completa e protezioni anti-DoS su file e tratti.</w:t>
             </w:r>
           </w:p>
         </w:tc>
@@ -8531,6 +8656,14 @@
       </w:pPr>
       <w:r>
         <w:t xml:space="preserve">Lo schermo al tavolo non si disconnette mai per inattività, quindi tiene acceso il server finché resta aperto.</w:t>
+      </w:r>
+    </w:p>
+    <w:p>
+      <w:pPr>
+        <w:pStyle w:val="ListBullet"/>
+      </w:pPr>
+      <w:r>
+        <w:t xml:space="preserve">La libreria degli asset generati con Gemini è memorizzata nel browser locale (IndexedDB): svuotando i dati del sito la libreria locale viene azzerata, ma gli asset già collocati sulla lavagna restano salvi sul server.</w:t>
       </w:r>
     </w:p>
     <w:sectPr>

</xml_diff>